<commit_message>
Practica Saptamana 1 new
</commit_message>
<xml_diff>
--- a/Ostrovetchii Denis It41Z_Practica_Sapt1.docx
+++ b/Ostrovetchii Denis It41Z_Practica_Sapt1.docx
@@ -476,15 +476,7 @@
           <w:sz w:val="24"/>
           <w:szCs w:val="24"/>
         </w:rPr>
-        <w:t xml:space="preserve"> Denis</w:t>
-      </w:r>
-      <w:r>
-        <w:rPr>
-          <w:rFonts w:ascii="Times New Roman" w:eastAsia="Times New Roman" w:hAnsi="Times New Roman" w:cs="Times New Roman"/>
-          <w:sz w:val="24"/>
-          <w:szCs w:val="24"/>
-        </w:rPr>
-        <w:t>, grupa IS41R</w:t>
+        <w:t xml:space="preserve"> Denis, grupa IS41R</w:t>
       </w:r>
     </w:p>
     <w:p>
@@ -571,6 +563,14 @@
         </w:rPr>
         <w:t>.202</w:t>
       </w:r>
+      <w:r>
+        <w:rPr>
+          <w:rFonts w:ascii="Times New Roman" w:eastAsia="Times New Roman" w:hAnsi="Times New Roman" w:cs="Times New Roman"/>
+          <w:sz w:val="24"/>
+          <w:szCs w:val="24"/>
+        </w:rPr>
+        <w:t>6</w:t>
+      </w:r>
     </w:p>
     <w:p>
       <w:pPr>
@@ -727,9 +727,15 @@
           <w:sz w:val="24"/>
           <w:szCs w:val="24"/>
         </w:rPr>
-        <w:t>Bălți, 2023</w:t>
-      </w:r>
-      <w:r>
+        <w:t>Bălți, 202</w:t>
+      </w:r>
+      <w:r>
+        <w:rPr>
+          <w:rFonts w:ascii="Times New Roman" w:eastAsia="Times New Roman" w:hAnsi="Times New Roman" w:cs="Times New Roman"/>
+          <w:b/>
+          <w:sz w:val="24"/>
+          <w:szCs w:val="24"/>
+        </w:rPr>
         <w:t>6</w:t>
       </w:r>
     </w:p>
@@ -772,799 +778,473 @@
     </w:p>
     <w:sdt>
       <w:sdtPr>
-        <w:id w:val="1539623359"/>
+        <w:rPr>
+          <w:rFonts w:ascii="Arial" w:eastAsia="Arial" w:hAnsi="Arial" w:cs="Arial"/>
+          <w:color w:val="auto"/>
+          <w:sz w:val="22"/>
+          <w:szCs w:val="22"/>
+          <w:lang w:val="ro-RO"/>
+        </w:rPr>
+        <w:id w:val="47034581"/>
         <w:docPartObj>
           <w:docPartGallery w:val="Table of Contents"/>
           <w:docPartUnique/>
         </w:docPartObj>
       </w:sdtPr>
+      <w:sdtEndPr>
+        <w:rPr>
+          <w:b/>
+          <w:bCs/>
+        </w:rPr>
+      </w:sdtEndPr>
       <w:sdtContent>
         <w:p>
           <w:pPr>
-            <w:widowControl w:val="0"/>
-            <w:tabs>
-              <w:tab w:val="right" w:pos="9070"/>
-            </w:tabs>
-            <w:spacing w:before="60" w:line="240" w:lineRule="auto"/>
+            <w:pStyle w:val="Titlucuprins"/>
             <w:rPr>
-              <w:rFonts w:ascii="Times New Roman" w:eastAsia="Times New Roman" w:hAnsi="Times New Roman" w:cs="Times New Roman"/>
-              <w:color w:val="000000"/>
-              <w:sz w:val="24"/>
-              <w:szCs w:val="24"/>
+              <w:rFonts w:ascii="Times New Roman" w:hAnsi="Times New Roman" w:cs="Times New Roman"/>
+              <w:bCs/>
+              <w:color w:val="000000" w:themeColor="text1"/>
+              <w14:shadow w14:blurRad="38100" w14:dist="19050" w14:dir="2700000" w14:sx="100000" w14:sy="100000" w14:kx="0" w14:ky="0" w14:algn="tl">
+                <w14:schemeClr w14:val="dk1">
+                  <w14:alpha w14:val="60000"/>
+                </w14:schemeClr>
+              </w14:shadow>
+              <w14:textOutline w14:w="0" w14:cap="flat" w14:cmpd="sng" w14:algn="ctr">
+                <w14:noFill/>
+                <w14:prstDash w14:val="solid"/>
+                <w14:round/>
+              </w14:textOutline>
             </w:rPr>
           </w:pPr>
           <w:r>
-            <w:fldChar w:fldCharType="begin"/>
-          </w:r>
-          <w:r>
-            <w:instrText xml:space="preserve"> TOC \h \u \z \t "Heading 1,1,Heading 2,2,Heading 3,3,Heading 4,4,Heading 5,5,Heading 6,6,"</w:instrText>
-          </w:r>
-          <w:r>
-            <w:fldChar w:fldCharType="separate"/>
-          </w:r>
-          <w:hyperlink w:anchor="_heading=h.30j0zll">
-            <w:r>
-              <w:rPr>
-                <w:rFonts w:ascii="Times New Roman" w:eastAsia="Times New Roman" w:hAnsi="Times New Roman" w:cs="Times New Roman"/>
-                <w:color w:val="000000"/>
-                <w:sz w:val="24"/>
-                <w:szCs w:val="24"/>
-              </w:rPr>
-              <w:t>Descrierea companiei</w:t>
-            </w:r>
-            <w:r>
-              <w:rPr>
-                <w:rFonts w:ascii="Times New Roman" w:eastAsia="Times New Roman" w:hAnsi="Times New Roman" w:cs="Times New Roman"/>
-                <w:color w:val="000000"/>
-                <w:sz w:val="24"/>
-                <w:szCs w:val="24"/>
-              </w:rPr>
-              <w:tab/>
-            </w:r>
-          </w:hyperlink>
-          <w:r>
-            <w:fldChar w:fldCharType="begin"/>
-          </w:r>
-          <w:r>
-            <w:instrText xml:space="preserve"> PAGEREF _heading=h.30j0zll \h </w:instrText>
-          </w:r>
-          <w:r>
-            <w:fldChar w:fldCharType="separate"/>
-          </w:r>
-          <w:r>
             <w:rPr>
-              <w:rFonts w:ascii="Times New Roman" w:eastAsia="Times New Roman" w:hAnsi="Times New Roman" w:cs="Times New Roman"/>
-              <w:sz w:val="24"/>
-              <w:szCs w:val="24"/>
+              <w:rFonts w:ascii="Times New Roman" w:hAnsi="Times New Roman" w:cs="Times New Roman"/>
+              <w:bCs/>
+              <w:color w:val="000000" w:themeColor="text1"/>
+              <w:lang w:val="ro-RO"/>
+              <w14:shadow w14:blurRad="38100" w14:dist="19050" w14:dir="2700000" w14:sx="100000" w14:sy="100000" w14:kx="0" w14:ky="0" w14:algn="tl">
+                <w14:schemeClr w14:val="dk1">
+                  <w14:alpha w14:val="60000"/>
+                </w14:schemeClr>
+              </w14:shadow>
+              <w14:textOutline w14:w="0" w14:cap="flat" w14:cmpd="sng" w14:algn="ctr">
+                <w14:noFill/>
+                <w14:prstDash w14:val="solid"/>
+                <w14:round/>
+              </w14:textOutline>
             </w:rPr>
-            <w:t>3</w:t>
-          </w:r>
-          <w:r>
-            <w:fldChar w:fldCharType="end"/>
+            <w:t>Cuprins</w:t>
           </w:r>
         </w:p>
         <w:p>
           <w:pPr>
-            <w:widowControl w:val="0"/>
+            <w:pStyle w:val="Cuprins1"/>
             <w:tabs>
-              <w:tab w:val="right" w:pos="9070"/>
+              <w:tab w:val="right" w:leader="dot" w:pos="9066"/>
             </w:tabs>
-            <w:spacing w:before="60" w:line="240" w:lineRule="auto"/>
             <w:rPr>
-              <w:rFonts w:ascii="Times New Roman" w:eastAsia="Times New Roman" w:hAnsi="Times New Roman" w:cs="Times New Roman"/>
-              <w:color w:val="000000"/>
+              <w:rFonts w:asciiTheme="minorHAnsi" w:eastAsiaTheme="minorEastAsia" w:hAnsiTheme="minorHAnsi" w:cstheme="minorBidi"/>
+              <w:noProof/>
+              <w:kern w:val="2"/>
               <w:sz w:val="24"/>
               <w:szCs w:val="24"/>
+              <w:lang w:val="ru-RU"/>
+              <w14:ligatures w14:val="standardContextual"/>
             </w:rPr>
           </w:pPr>
-          <w:hyperlink w:anchor="_heading=h.1fob9te">
-            <w:r>
-              <w:rPr>
-                <w:rFonts w:ascii="Times New Roman" w:eastAsia="Times New Roman" w:hAnsi="Times New Roman" w:cs="Times New Roman"/>
-                <w:color w:val="000000"/>
-                <w:sz w:val="24"/>
-                <w:szCs w:val="24"/>
-              </w:rPr>
-              <w:t>Achiziționarea a 42 de ghișee mobile pentru dotarea direcțiilor județene.</w:t>
-            </w:r>
-            <w:r>
-              <w:rPr>
-                <w:rFonts w:ascii="Times New Roman" w:eastAsia="Times New Roman" w:hAnsi="Times New Roman" w:cs="Times New Roman"/>
-                <w:color w:val="000000"/>
-                <w:sz w:val="24"/>
-                <w:szCs w:val="24"/>
-              </w:rPr>
-              <w:tab/>
-            </w:r>
-          </w:hyperlink>
           <w:r>
+            <w:rPr>
+              <w:rFonts w:ascii="Times New Roman" w:hAnsi="Times New Roman" w:cs="Times New Roman"/>
+            </w:rPr>
             <w:fldChar w:fldCharType="begin"/>
           </w:r>
           <w:r>
-            <w:instrText xml:space="preserve"> PAGEREF _heading=h.1fob9te \h </w:instrText>
-          </w:r>
-          <w:r>
-            <w:fldChar w:fldCharType="separate"/>
+            <w:rPr>
+              <w:rFonts w:ascii="Times New Roman" w:hAnsi="Times New Roman" w:cs="Times New Roman"/>
+            </w:rPr>
+            <w:instrText xml:space="preserve"> TOC \o "1-3" \h \z \u </w:instrText>
           </w:r>
           <w:r>
             <w:rPr>
-              <w:rFonts w:ascii="Times New Roman" w:eastAsia="Times New Roman" w:hAnsi="Times New Roman" w:cs="Times New Roman"/>
-              <w:sz w:val="24"/>
-              <w:szCs w:val="24"/>
+              <w:rFonts w:ascii="Times New Roman" w:hAnsi="Times New Roman" w:cs="Times New Roman"/>
             </w:rPr>
-            <w:t>4</w:t>
+            <w:fldChar w:fldCharType="separate"/>
           </w:r>
-          <w:r>
-            <w:fldChar w:fldCharType="end"/>
-          </w:r>
+          <w:hyperlink w:anchor="_Toc243691414" w:history="1">
+            <w:r>
+              <w:rPr>
+                <w:rStyle w:val="Hyperlink"/>
+                <w:rFonts w:ascii="Times New Roman" w:eastAsia="Times New Roman" w:hAnsi="Times New Roman" w:cs="Times New Roman"/>
+                <w:b/>
+                <w:noProof/>
+              </w:rPr>
+              <w:t>Descrierea companiei</w:t>
+            </w:r>
+            <w:r>
+              <w:rPr>
+                <w:noProof/>
+                <w:webHidden/>
+              </w:rPr>
+              <w:tab/>
+            </w:r>
+            <w:r>
+              <w:rPr>
+                <w:noProof/>
+                <w:webHidden/>
+              </w:rPr>
+              <w:fldChar w:fldCharType="begin"/>
+            </w:r>
+            <w:r>
+              <w:rPr>
+                <w:noProof/>
+                <w:webHidden/>
+              </w:rPr>
+              <w:instrText xml:space="preserve"> PAGEREF _Toc243691414 \h </w:instrText>
+            </w:r>
+            <w:r>
+              <w:rPr>
+                <w:noProof/>
+                <w:webHidden/>
+              </w:rPr>
+            </w:r>
+            <w:r>
+              <w:rPr>
+                <w:noProof/>
+                <w:webHidden/>
+              </w:rPr>
+              <w:fldChar w:fldCharType="separate"/>
+            </w:r>
+            <w:r>
+              <w:rPr>
+                <w:noProof/>
+                <w:webHidden/>
+              </w:rPr>
+              <w:t>3</w:t>
+            </w:r>
+            <w:r>
+              <w:rPr>
+                <w:noProof/>
+                <w:webHidden/>
+              </w:rPr>
+              <w:fldChar w:fldCharType="end"/>
+            </w:r>
+          </w:hyperlink>
         </w:p>
         <w:p>
           <w:pPr>
-            <w:widowControl w:val="0"/>
+            <w:pStyle w:val="Cuprins1"/>
             <w:tabs>
-              <w:tab w:val="right" w:pos="9070"/>
+              <w:tab w:val="right" w:leader="dot" w:pos="9066"/>
             </w:tabs>
-            <w:spacing w:before="60" w:line="240" w:lineRule="auto"/>
             <w:rPr>
-              <w:rFonts w:ascii="Times New Roman" w:eastAsia="Times New Roman" w:hAnsi="Times New Roman" w:cs="Times New Roman"/>
-              <w:color w:val="000000"/>
+              <w:rFonts w:asciiTheme="minorHAnsi" w:eastAsiaTheme="minorEastAsia" w:hAnsiTheme="minorHAnsi" w:cstheme="minorBidi"/>
+              <w:noProof/>
+              <w:kern w:val="2"/>
               <w:sz w:val="24"/>
               <w:szCs w:val="24"/>
+              <w:lang w:val="ru-RU"/>
+              <w14:ligatures w14:val="standardContextual"/>
             </w:rPr>
           </w:pPr>
-          <w:hyperlink w:anchor="_heading=h.3znysh7">
-            <w:r>
-              <w:rPr>
-                <w:rFonts w:ascii="Times New Roman" w:eastAsia="Times New Roman" w:hAnsi="Times New Roman" w:cs="Times New Roman"/>
-                <w:color w:val="000000"/>
-                <w:sz w:val="24"/>
-                <w:szCs w:val="24"/>
-              </w:rPr>
-              <w:t>Planul calendaristic săptămânal</w:t>
-            </w:r>
-            <w:r>
-              <w:rPr>
-                <w:rFonts w:ascii="Times New Roman" w:eastAsia="Times New Roman" w:hAnsi="Times New Roman" w:cs="Times New Roman"/>
-                <w:color w:val="000000"/>
-                <w:sz w:val="24"/>
-                <w:szCs w:val="24"/>
+          <w:hyperlink w:anchor="_Toc243691415" w:history="1">
+            <w:r>
+              <w:rPr>
+                <w:rStyle w:val="Hyperlink"/>
+                <w:rFonts w:ascii="Times New Roman" w:eastAsia="Times New Roman" w:hAnsi="Times New Roman" w:cs="Times New Roman"/>
+                <w:b/>
+                <w:bCs/>
+                <w:noProof/>
+                <w:lang w:val="en-US"/>
+              </w:rPr>
+              <w:t>Descreierea proiectului: Dezvoltarea unui Sistem de Traducere Automată bazat pe Arhitectura Transformer (Python)</w:t>
+            </w:r>
+            <w:r>
+              <w:rPr>
+                <w:noProof/>
+                <w:webHidden/>
               </w:rPr>
               <w:tab/>
             </w:r>
+            <w:r>
+              <w:rPr>
+                <w:noProof/>
+                <w:webHidden/>
+              </w:rPr>
+              <w:fldChar w:fldCharType="begin"/>
+            </w:r>
+            <w:r>
+              <w:rPr>
+                <w:noProof/>
+                <w:webHidden/>
+              </w:rPr>
+              <w:instrText xml:space="preserve"> PAGEREF _Toc243691415 \h </w:instrText>
+            </w:r>
+            <w:r>
+              <w:rPr>
+                <w:noProof/>
+                <w:webHidden/>
+              </w:rPr>
+            </w:r>
+            <w:r>
+              <w:rPr>
+                <w:noProof/>
+                <w:webHidden/>
+              </w:rPr>
+              <w:fldChar w:fldCharType="separate"/>
+            </w:r>
+            <w:r>
+              <w:rPr>
+                <w:noProof/>
+                <w:webHidden/>
+              </w:rPr>
+              <w:t>4</w:t>
+            </w:r>
+            <w:r>
+              <w:rPr>
+                <w:noProof/>
+                <w:webHidden/>
+              </w:rPr>
+              <w:fldChar w:fldCharType="end"/>
+            </w:r>
           </w:hyperlink>
-          <w:r>
-            <w:fldChar w:fldCharType="begin"/>
-          </w:r>
-          <w:r>
-            <w:instrText xml:space="preserve"> PAGEREF _heading=h.3znysh7 \h </w:instrText>
-          </w:r>
-          <w:r>
-            <w:fldChar w:fldCharType="separate"/>
-          </w:r>
-          <w:r>
-            <w:rPr>
-              <w:rFonts w:ascii="Times New Roman" w:eastAsia="Times New Roman" w:hAnsi="Times New Roman" w:cs="Times New Roman"/>
-              <w:sz w:val="24"/>
-              <w:szCs w:val="24"/>
-            </w:rPr>
-            <w:t>5</w:t>
-          </w:r>
-          <w:r>
-            <w:fldChar w:fldCharType="end"/>
-          </w:r>
         </w:p>
         <w:p>
           <w:pPr>
-            <w:widowControl w:val="0"/>
+            <w:pStyle w:val="Cuprins1"/>
             <w:tabs>
-              <w:tab w:val="right" w:pos="9070"/>
+              <w:tab w:val="right" w:leader="dot" w:pos="9066"/>
             </w:tabs>
-            <w:spacing w:before="60" w:line="240" w:lineRule="auto"/>
             <w:rPr>
-              <w:rFonts w:ascii="Times New Roman" w:eastAsia="Times New Roman" w:hAnsi="Times New Roman" w:cs="Times New Roman"/>
-              <w:color w:val="000000"/>
+              <w:rFonts w:asciiTheme="minorHAnsi" w:eastAsiaTheme="minorEastAsia" w:hAnsiTheme="minorHAnsi" w:cstheme="minorBidi"/>
+              <w:noProof/>
+              <w:kern w:val="2"/>
               <w:sz w:val="24"/>
               <w:szCs w:val="24"/>
+              <w:lang w:val="ru-RU"/>
+              <w14:ligatures w14:val="standardContextual"/>
             </w:rPr>
           </w:pPr>
-          <w:hyperlink w:anchor="_heading=h.2et92p0">
-            <w:r>
-              <w:rPr>
-                <w:rFonts w:ascii="Times New Roman" w:eastAsia="Times New Roman" w:hAnsi="Times New Roman" w:cs="Times New Roman"/>
-                <w:color w:val="000000"/>
-                <w:sz w:val="24"/>
-                <w:szCs w:val="24"/>
-              </w:rPr>
-              <w:t>Agenda zilnică a lucrărilor executate</w:t>
-            </w:r>
-            <w:r>
-              <w:rPr>
-                <w:rFonts w:ascii="Times New Roman" w:eastAsia="Times New Roman" w:hAnsi="Times New Roman" w:cs="Times New Roman"/>
-                <w:color w:val="000000"/>
-                <w:sz w:val="24"/>
-                <w:szCs w:val="24"/>
+          <w:hyperlink w:anchor="_Toc243691416" w:history="1">
+            <w:r>
+              <w:rPr>
+                <w:rStyle w:val="Hyperlink"/>
+                <w:rFonts w:ascii="Times New Roman" w:eastAsia="Times New Roman" w:hAnsi="Times New Roman" w:cs="Times New Roman"/>
+                <w:b/>
+                <w:noProof/>
+              </w:rPr>
+              <w:t>Planul calendaristic săptămânal</w:t>
+            </w:r>
+            <w:r>
+              <w:rPr>
+                <w:noProof/>
+                <w:webHidden/>
               </w:rPr>
               <w:tab/>
             </w:r>
+            <w:r>
+              <w:rPr>
+                <w:noProof/>
+                <w:webHidden/>
+              </w:rPr>
+              <w:fldChar w:fldCharType="begin"/>
+            </w:r>
+            <w:r>
+              <w:rPr>
+                <w:noProof/>
+                <w:webHidden/>
+              </w:rPr>
+              <w:instrText xml:space="preserve"> PAGEREF _Toc243691416 \h </w:instrText>
+            </w:r>
+            <w:r>
+              <w:rPr>
+                <w:noProof/>
+                <w:webHidden/>
+              </w:rPr>
+            </w:r>
+            <w:r>
+              <w:rPr>
+                <w:noProof/>
+                <w:webHidden/>
+              </w:rPr>
+              <w:fldChar w:fldCharType="separate"/>
+            </w:r>
+            <w:r>
+              <w:rPr>
+                <w:noProof/>
+                <w:webHidden/>
+              </w:rPr>
+              <w:t>5</w:t>
+            </w:r>
+            <w:r>
+              <w:rPr>
+                <w:noProof/>
+                <w:webHidden/>
+              </w:rPr>
+              <w:fldChar w:fldCharType="end"/>
+            </w:r>
           </w:hyperlink>
-          <w:r>
-            <w:fldChar w:fldCharType="begin"/>
-          </w:r>
-          <w:r>
-            <w:instrText xml:space="preserve"> PAGEREF _heading=h.2et92p0 \h </w:instrText>
-          </w:r>
-          <w:r>
-            <w:fldChar w:fldCharType="separate"/>
-          </w:r>
-          <w:r>
-            <w:rPr>
-              <w:rFonts w:ascii="Times New Roman" w:eastAsia="Times New Roman" w:hAnsi="Times New Roman" w:cs="Times New Roman"/>
-              <w:sz w:val="24"/>
-              <w:szCs w:val="24"/>
-            </w:rPr>
-            <w:t>6</w:t>
-          </w:r>
-          <w:r>
-            <w:fldChar w:fldCharType="end"/>
-          </w:r>
         </w:p>
         <w:p>
           <w:pPr>
-            <w:widowControl w:val="0"/>
+            <w:pStyle w:val="Cuprins1"/>
             <w:tabs>
-              <w:tab w:val="right" w:pos="9070"/>
+              <w:tab w:val="right" w:leader="dot" w:pos="9066"/>
             </w:tabs>
-            <w:spacing w:before="60" w:line="240" w:lineRule="auto"/>
-            <w:ind w:left="360"/>
             <w:rPr>
-              <w:rFonts w:ascii="Times New Roman" w:eastAsia="Times New Roman" w:hAnsi="Times New Roman" w:cs="Times New Roman"/>
-              <w:color w:val="000000"/>
+              <w:rFonts w:asciiTheme="minorHAnsi" w:eastAsiaTheme="minorEastAsia" w:hAnsiTheme="minorHAnsi" w:cstheme="minorBidi"/>
+              <w:noProof/>
+              <w:kern w:val="2"/>
               <w:sz w:val="24"/>
               <w:szCs w:val="24"/>
+              <w:lang w:val="ru-RU"/>
+              <w14:ligatures w14:val="standardContextual"/>
             </w:rPr>
           </w:pPr>
-          <w:hyperlink w:anchor="_heading=h.tyjcwt">
-            <w:r>
-              <w:rPr>
-                <w:rFonts w:ascii="Times New Roman" w:eastAsia="Times New Roman" w:hAnsi="Times New Roman" w:cs="Times New Roman"/>
-                <w:color w:val="000000"/>
-                <w:sz w:val="24"/>
-                <w:szCs w:val="24"/>
-              </w:rPr>
-              <w:t>Săptămâna I</w:t>
-            </w:r>
-            <w:r>
-              <w:rPr>
-                <w:rFonts w:ascii="Times New Roman" w:eastAsia="Times New Roman" w:hAnsi="Times New Roman" w:cs="Times New Roman"/>
-                <w:color w:val="000000"/>
-                <w:sz w:val="24"/>
-                <w:szCs w:val="24"/>
+          <w:hyperlink w:anchor="_Toc243691417" w:history="1">
+            <w:r>
+              <w:rPr>
+                <w:rStyle w:val="Hyperlink"/>
+                <w:rFonts w:ascii="Times New Roman" w:eastAsia="Times New Roman" w:hAnsi="Times New Roman" w:cs="Times New Roman"/>
+                <w:b/>
+                <w:noProof/>
+              </w:rPr>
+              <w:t>Agenda zilnică a lucrărilor executate</w:t>
+            </w:r>
+            <w:r>
+              <w:rPr>
+                <w:noProof/>
+                <w:webHidden/>
               </w:rPr>
               <w:tab/>
             </w:r>
+            <w:r>
+              <w:rPr>
+                <w:noProof/>
+                <w:webHidden/>
+              </w:rPr>
+              <w:fldChar w:fldCharType="begin"/>
+            </w:r>
+            <w:r>
+              <w:rPr>
+                <w:noProof/>
+                <w:webHidden/>
+              </w:rPr>
+              <w:instrText xml:space="preserve"> PAGEREF _Toc243691417 \h </w:instrText>
+            </w:r>
+            <w:r>
+              <w:rPr>
+                <w:noProof/>
+                <w:webHidden/>
+              </w:rPr>
+            </w:r>
+            <w:r>
+              <w:rPr>
+                <w:noProof/>
+                <w:webHidden/>
+              </w:rPr>
+              <w:fldChar w:fldCharType="separate"/>
+            </w:r>
+            <w:r>
+              <w:rPr>
+                <w:noProof/>
+                <w:webHidden/>
+              </w:rPr>
+              <w:t>6</w:t>
+            </w:r>
+            <w:r>
+              <w:rPr>
+                <w:noProof/>
+                <w:webHidden/>
+              </w:rPr>
+              <w:fldChar w:fldCharType="end"/>
+            </w:r>
           </w:hyperlink>
-          <w:r>
-            <w:fldChar w:fldCharType="begin"/>
-          </w:r>
-          <w:r>
-            <w:instrText xml:space="preserve"> PAGEREF _heading=h.tyjcwt \h </w:instrText>
-          </w:r>
-          <w:r>
-            <w:fldChar w:fldCharType="separate"/>
-          </w:r>
-          <w:r>
-            <w:rPr>
-              <w:rFonts w:ascii="Times New Roman" w:eastAsia="Times New Roman" w:hAnsi="Times New Roman" w:cs="Times New Roman"/>
-              <w:sz w:val="24"/>
-              <w:szCs w:val="24"/>
-            </w:rPr>
-            <w:t>6</w:t>
-          </w:r>
-          <w:r>
-            <w:fldChar w:fldCharType="end"/>
-          </w:r>
         </w:p>
         <w:p>
           <w:pPr>
-            <w:widowControl w:val="0"/>
+            <w:pStyle w:val="Cuprins2"/>
             <w:tabs>
-              <w:tab w:val="right" w:pos="9070"/>
+              <w:tab w:val="right" w:leader="dot" w:pos="9066"/>
             </w:tabs>
-            <w:spacing w:before="60" w:line="240" w:lineRule="auto"/>
-            <w:ind w:left="360"/>
             <w:rPr>
-              <w:rFonts w:ascii="Times New Roman" w:eastAsia="Times New Roman" w:hAnsi="Times New Roman" w:cs="Times New Roman"/>
-              <w:color w:val="000000"/>
+              <w:rFonts w:asciiTheme="minorHAnsi" w:eastAsiaTheme="minorEastAsia" w:hAnsiTheme="minorHAnsi" w:cstheme="minorBidi"/>
+              <w:noProof/>
+              <w:kern w:val="2"/>
               <w:sz w:val="24"/>
               <w:szCs w:val="24"/>
+              <w:lang w:val="ru-RU"/>
+              <w14:ligatures w14:val="standardContextual"/>
             </w:rPr>
           </w:pPr>
-          <w:hyperlink w:anchor="_heading=h.3dy6vkm">
-            <w:r>
-              <w:rPr>
-                <w:rFonts w:ascii="Times New Roman" w:eastAsia="Times New Roman" w:hAnsi="Times New Roman" w:cs="Times New Roman"/>
-                <w:color w:val="000000"/>
-                <w:sz w:val="24"/>
-                <w:szCs w:val="24"/>
-              </w:rPr>
-              <w:t>Săptămâna II</w:t>
-            </w:r>
-            <w:r>
-              <w:rPr>
-                <w:rFonts w:ascii="Times New Roman" w:eastAsia="Times New Roman" w:hAnsi="Times New Roman" w:cs="Times New Roman"/>
-                <w:color w:val="000000"/>
-                <w:sz w:val="24"/>
-                <w:szCs w:val="24"/>
+          <w:hyperlink w:anchor="_Toc243691418" w:history="1">
+            <w:r>
+              <w:rPr>
+                <w:rStyle w:val="Hyperlink"/>
+                <w:rFonts w:ascii="Times New Roman" w:eastAsia="Times New Roman" w:hAnsi="Times New Roman" w:cs="Times New Roman"/>
+                <w:b/>
+                <w:noProof/>
+              </w:rPr>
+              <w:t>Săptămâna I</w:t>
+            </w:r>
+            <w:r>
+              <w:rPr>
+                <w:noProof/>
+                <w:webHidden/>
               </w:rPr>
               <w:tab/>
             </w:r>
+            <w:r>
+              <w:rPr>
+                <w:noProof/>
+                <w:webHidden/>
+              </w:rPr>
+              <w:fldChar w:fldCharType="begin"/>
+            </w:r>
+            <w:r>
+              <w:rPr>
+                <w:noProof/>
+                <w:webHidden/>
+              </w:rPr>
+              <w:instrText xml:space="preserve"> PAGEREF _Toc243691418 \h </w:instrText>
+            </w:r>
+            <w:r>
+              <w:rPr>
+                <w:noProof/>
+                <w:webHidden/>
+              </w:rPr>
+            </w:r>
+            <w:r>
+              <w:rPr>
+                <w:noProof/>
+                <w:webHidden/>
+              </w:rPr>
+              <w:fldChar w:fldCharType="separate"/>
+            </w:r>
+            <w:r>
+              <w:rPr>
+                <w:noProof/>
+                <w:webHidden/>
+              </w:rPr>
+              <w:t>6</w:t>
+            </w:r>
+            <w:r>
+              <w:rPr>
+                <w:noProof/>
+                <w:webHidden/>
+              </w:rPr>
+              <w:fldChar w:fldCharType="end"/>
+            </w:r>
           </w:hyperlink>
-          <w:r>
-            <w:fldChar w:fldCharType="begin"/>
-          </w:r>
-          <w:r>
-            <w:instrText xml:space="preserve"> PAGEREF _heading=h.3dy6vkm \h </w:instrText>
-          </w:r>
-          <w:r>
-            <w:fldChar w:fldCharType="separate"/>
-          </w:r>
+        </w:p>
+        <w:p>
           <w:r>
             <w:rPr>
-              <w:rFonts w:ascii="Times New Roman" w:eastAsia="Times New Roman" w:hAnsi="Times New Roman" w:cs="Times New Roman"/>
-              <w:sz w:val="24"/>
-              <w:szCs w:val="24"/>
+              <w:rFonts w:ascii="Times New Roman" w:hAnsi="Times New Roman" w:cs="Times New Roman"/>
+              <w:b/>
+              <w:bCs/>
+              <w:lang w:val="ro-RO"/>
             </w:rPr>
-            <w:t>6</w:t>
-          </w:r>
-          <w:r>
-            <w:fldChar w:fldCharType="end"/>
-          </w:r>
-        </w:p>
-        <w:p>
-          <w:pPr>
-            <w:widowControl w:val="0"/>
-            <w:tabs>
-              <w:tab w:val="right" w:pos="9070"/>
-            </w:tabs>
-            <w:spacing w:before="60" w:line="240" w:lineRule="auto"/>
-            <w:ind w:left="360"/>
-            <w:rPr>
-              <w:rFonts w:ascii="Times New Roman" w:eastAsia="Times New Roman" w:hAnsi="Times New Roman" w:cs="Times New Roman"/>
-              <w:color w:val="000000"/>
-              <w:sz w:val="24"/>
-              <w:szCs w:val="24"/>
-            </w:rPr>
-          </w:pPr>
-          <w:hyperlink w:anchor="_heading=h.1t3h5sf">
-            <w:r>
-              <w:rPr>
-                <w:rFonts w:ascii="Times New Roman" w:eastAsia="Times New Roman" w:hAnsi="Times New Roman" w:cs="Times New Roman"/>
-                <w:color w:val="000000"/>
-                <w:sz w:val="24"/>
-                <w:szCs w:val="24"/>
-              </w:rPr>
-              <w:t>Săptămâna III</w:t>
-            </w:r>
-            <w:r>
-              <w:rPr>
-                <w:rFonts w:ascii="Times New Roman" w:eastAsia="Times New Roman" w:hAnsi="Times New Roman" w:cs="Times New Roman"/>
-                <w:color w:val="000000"/>
-                <w:sz w:val="24"/>
-                <w:szCs w:val="24"/>
-              </w:rPr>
-              <w:tab/>
-            </w:r>
-          </w:hyperlink>
-          <w:r>
-            <w:fldChar w:fldCharType="begin"/>
-          </w:r>
-          <w:r>
-            <w:instrText xml:space="preserve"> PAGEREF _heading=h.1t3h5sf \h </w:instrText>
-          </w:r>
-          <w:r>
-            <w:fldChar w:fldCharType="separate"/>
-          </w:r>
-          <w:r>
-            <w:rPr>
-              <w:rFonts w:ascii="Times New Roman" w:eastAsia="Times New Roman" w:hAnsi="Times New Roman" w:cs="Times New Roman"/>
-              <w:sz w:val="24"/>
-              <w:szCs w:val="24"/>
-            </w:rPr>
-            <w:t>6</w:t>
-          </w:r>
-          <w:r>
-            <w:fldChar w:fldCharType="end"/>
-          </w:r>
-        </w:p>
-        <w:p>
-          <w:pPr>
-            <w:widowControl w:val="0"/>
-            <w:tabs>
-              <w:tab w:val="right" w:pos="9070"/>
-            </w:tabs>
-            <w:spacing w:before="60" w:line="240" w:lineRule="auto"/>
-            <w:ind w:left="360"/>
-            <w:rPr>
-              <w:rFonts w:ascii="Times New Roman" w:eastAsia="Times New Roman" w:hAnsi="Times New Roman" w:cs="Times New Roman"/>
-              <w:color w:val="000000"/>
-              <w:sz w:val="24"/>
-              <w:szCs w:val="24"/>
-            </w:rPr>
-          </w:pPr>
-          <w:hyperlink w:anchor="_heading=h.4d34og8">
-            <w:r>
-              <w:rPr>
-                <w:rFonts w:ascii="Times New Roman" w:eastAsia="Times New Roman" w:hAnsi="Times New Roman" w:cs="Times New Roman"/>
-                <w:color w:val="000000"/>
-                <w:sz w:val="24"/>
-                <w:szCs w:val="24"/>
-              </w:rPr>
-              <w:t>Săptămâna IV</w:t>
-            </w:r>
-            <w:r>
-              <w:rPr>
-                <w:rFonts w:ascii="Times New Roman" w:eastAsia="Times New Roman" w:hAnsi="Times New Roman" w:cs="Times New Roman"/>
-                <w:color w:val="000000"/>
-                <w:sz w:val="24"/>
-                <w:szCs w:val="24"/>
-              </w:rPr>
-              <w:tab/>
-            </w:r>
-          </w:hyperlink>
-          <w:r>
-            <w:fldChar w:fldCharType="begin"/>
-          </w:r>
-          <w:r>
-            <w:instrText xml:space="preserve"> PAGEREF _heading=h.4d34og8 \h </w:instrText>
-          </w:r>
-          <w:r>
-            <w:fldChar w:fldCharType="separate"/>
-          </w:r>
-          <w:r>
-            <w:rPr>
-              <w:rFonts w:ascii="Times New Roman" w:eastAsia="Times New Roman" w:hAnsi="Times New Roman" w:cs="Times New Roman"/>
-              <w:sz w:val="24"/>
-              <w:szCs w:val="24"/>
-            </w:rPr>
-            <w:t>7</w:t>
-          </w:r>
-          <w:r>
-            <w:fldChar w:fldCharType="end"/>
-          </w:r>
-        </w:p>
-        <w:p>
-          <w:pPr>
-            <w:widowControl w:val="0"/>
-            <w:tabs>
-              <w:tab w:val="right" w:pos="9070"/>
-            </w:tabs>
-            <w:spacing w:before="60" w:line="240" w:lineRule="auto"/>
-            <w:ind w:left="360"/>
-            <w:rPr>
-              <w:rFonts w:ascii="Times New Roman" w:eastAsia="Times New Roman" w:hAnsi="Times New Roman" w:cs="Times New Roman"/>
-              <w:color w:val="000000"/>
-              <w:sz w:val="24"/>
-              <w:szCs w:val="24"/>
-            </w:rPr>
-          </w:pPr>
-          <w:hyperlink w:anchor="_heading=h.2s8eyo1">
-            <w:r>
-              <w:rPr>
-                <w:rFonts w:ascii="Times New Roman" w:eastAsia="Times New Roman" w:hAnsi="Times New Roman" w:cs="Times New Roman"/>
-                <w:color w:val="000000"/>
-                <w:sz w:val="24"/>
-                <w:szCs w:val="24"/>
-              </w:rPr>
-              <w:t>Săptămâna V</w:t>
-            </w:r>
-            <w:r>
-              <w:rPr>
-                <w:rFonts w:ascii="Times New Roman" w:eastAsia="Times New Roman" w:hAnsi="Times New Roman" w:cs="Times New Roman"/>
-                <w:color w:val="000000"/>
-                <w:sz w:val="24"/>
-                <w:szCs w:val="24"/>
-              </w:rPr>
-              <w:tab/>
-            </w:r>
-          </w:hyperlink>
-          <w:r>
-            <w:fldChar w:fldCharType="begin"/>
-          </w:r>
-          <w:r>
-            <w:instrText xml:space="preserve"> PAGEREF _heading=h.2s8eyo1 \h </w:instrText>
-          </w:r>
-          <w:r>
-            <w:fldChar w:fldCharType="separate"/>
-          </w:r>
-          <w:r>
-            <w:rPr>
-              <w:rFonts w:ascii="Times New Roman" w:eastAsia="Times New Roman" w:hAnsi="Times New Roman" w:cs="Times New Roman"/>
-              <w:sz w:val="24"/>
-              <w:szCs w:val="24"/>
-            </w:rPr>
-            <w:t>7</w:t>
-          </w:r>
-          <w:r>
-            <w:fldChar w:fldCharType="end"/>
-          </w:r>
-        </w:p>
-        <w:p>
-          <w:pPr>
-            <w:widowControl w:val="0"/>
-            <w:tabs>
-              <w:tab w:val="right" w:pos="9070"/>
-            </w:tabs>
-            <w:spacing w:before="60" w:line="240" w:lineRule="auto"/>
-            <w:ind w:left="360"/>
-            <w:rPr>
-              <w:rFonts w:ascii="Times New Roman" w:eastAsia="Times New Roman" w:hAnsi="Times New Roman" w:cs="Times New Roman"/>
-              <w:color w:val="000000"/>
-              <w:sz w:val="24"/>
-              <w:szCs w:val="24"/>
-            </w:rPr>
-          </w:pPr>
-          <w:hyperlink w:anchor="_heading=h.17dp8vu">
-            <w:r>
-              <w:rPr>
-                <w:rFonts w:ascii="Times New Roman" w:eastAsia="Times New Roman" w:hAnsi="Times New Roman" w:cs="Times New Roman"/>
-                <w:color w:val="000000"/>
-                <w:sz w:val="24"/>
-                <w:szCs w:val="24"/>
-              </w:rPr>
-              <w:t>Săptămâna VI</w:t>
-            </w:r>
-            <w:r>
-              <w:rPr>
-                <w:rFonts w:ascii="Times New Roman" w:eastAsia="Times New Roman" w:hAnsi="Times New Roman" w:cs="Times New Roman"/>
-                <w:color w:val="000000"/>
-                <w:sz w:val="24"/>
-                <w:szCs w:val="24"/>
-              </w:rPr>
-              <w:tab/>
-            </w:r>
-          </w:hyperlink>
-          <w:r>
-            <w:fldChar w:fldCharType="begin"/>
-          </w:r>
-          <w:r>
-            <w:instrText xml:space="preserve"> PAGEREF _heading=h.17dp8vu \h </w:instrText>
-          </w:r>
-          <w:r>
-            <w:fldChar w:fldCharType="separate"/>
-          </w:r>
-          <w:r>
-            <w:rPr>
-              <w:rFonts w:ascii="Times New Roman" w:eastAsia="Times New Roman" w:hAnsi="Times New Roman" w:cs="Times New Roman"/>
-              <w:sz w:val="24"/>
-              <w:szCs w:val="24"/>
-            </w:rPr>
-            <w:t>7</w:t>
-          </w:r>
-          <w:r>
-            <w:fldChar w:fldCharType="end"/>
-          </w:r>
-        </w:p>
-        <w:p>
-          <w:pPr>
-            <w:widowControl w:val="0"/>
-            <w:tabs>
-              <w:tab w:val="right" w:pos="9070"/>
-            </w:tabs>
-            <w:spacing w:before="60" w:line="240" w:lineRule="auto"/>
-            <w:ind w:left="360"/>
-            <w:rPr>
-              <w:rFonts w:ascii="Times New Roman" w:eastAsia="Times New Roman" w:hAnsi="Times New Roman" w:cs="Times New Roman"/>
-              <w:color w:val="000000"/>
-              <w:sz w:val="24"/>
-              <w:szCs w:val="24"/>
-            </w:rPr>
-          </w:pPr>
-          <w:hyperlink w:anchor="_heading=h.3rdcrjn">
-            <w:r>
-              <w:rPr>
-                <w:rFonts w:ascii="Times New Roman" w:eastAsia="Times New Roman" w:hAnsi="Times New Roman" w:cs="Times New Roman"/>
-                <w:color w:val="000000"/>
-                <w:sz w:val="24"/>
-                <w:szCs w:val="24"/>
-              </w:rPr>
-              <w:t>Săptămâna VII</w:t>
-            </w:r>
-            <w:r>
-              <w:rPr>
-                <w:rFonts w:ascii="Times New Roman" w:eastAsia="Times New Roman" w:hAnsi="Times New Roman" w:cs="Times New Roman"/>
-                <w:color w:val="000000"/>
-                <w:sz w:val="24"/>
-                <w:szCs w:val="24"/>
-              </w:rPr>
-              <w:tab/>
-            </w:r>
-          </w:hyperlink>
-          <w:r>
-            <w:fldChar w:fldCharType="begin"/>
-          </w:r>
-          <w:r>
-            <w:instrText xml:space="preserve"> PAGEREF _heading=h.3rdcrjn \h </w:instrText>
-          </w:r>
-          <w:r>
-            <w:fldChar w:fldCharType="separate"/>
-          </w:r>
-          <w:r>
-            <w:rPr>
-              <w:rFonts w:ascii="Times New Roman" w:eastAsia="Times New Roman" w:hAnsi="Times New Roman" w:cs="Times New Roman"/>
-              <w:sz w:val="24"/>
-              <w:szCs w:val="24"/>
-            </w:rPr>
-            <w:t>8</w:t>
-          </w:r>
-          <w:r>
-            <w:fldChar w:fldCharType="end"/>
-          </w:r>
-        </w:p>
-        <w:p>
-          <w:pPr>
-            <w:widowControl w:val="0"/>
-            <w:tabs>
-              <w:tab w:val="right" w:pos="9070"/>
-            </w:tabs>
-            <w:spacing w:before="60" w:line="240" w:lineRule="auto"/>
-            <w:rPr>
-              <w:rFonts w:ascii="Times New Roman" w:eastAsia="Times New Roman" w:hAnsi="Times New Roman" w:cs="Times New Roman"/>
-              <w:color w:val="000000"/>
-              <w:sz w:val="24"/>
-              <w:szCs w:val="24"/>
-            </w:rPr>
-          </w:pPr>
-          <w:hyperlink w:anchor="_heading=h.26in1rg">
-            <w:r>
-              <w:rPr>
-                <w:rFonts w:ascii="Times New Roman" w:eastAsia="Times New Roman" w:hAnsi="Times New Roman" w:cs="Times New Roman"/>
-                <w:color w:val="000000"/>
-                <w:sz w:val="24"/>
-                <w:szCs w:val="24"/>
-              </w:rPr>
-              <w:t>Tehnologii și competențe demonstrate</w:t>
-            </w:r>
-            <w:r>
-              <w:rPr>
-                <w:rFonts w:ascii="Times New Roman" w:eastAsia="Times New Roman" w:hAnsi="Times New Roman" w:cs="Times New Roman"/>
-                <w:color w:val="000000"/>
-                <w:sz w:val="24"/>
-                <w:szCs w:val="24"/>
-              </w:rPr>
-              <w:tab/>
-            </w:r>
-          </w:hyperlink>
-          <w:r>
-            <w:fldChar w:fldCharType="begin"/>
-          </w:r>
-          <w:r>
-            <w:instrText xml:space="preserve"> PAGEREF _heading=h.26in1rg \h </w:instrText>
-          </w:r>
-          <w:r>
-            <w:fldChar w:fldCharType="separate"/>
-          </w:r>
-          <w:r>
-            <w:rPr>
-              <w:rFonts w:ascii="Times New Roman" w:eastAsia="Times New Roman" w:hAnsi="Times New Roman" w:cs="Times New Roman"/>
-              <w:sz w:val="24"/>
-              <w:szCs w:val="24"/>
-            </w:rPr>
-            <w:t>9</w:t>
-          </w:r>
-          <w:r>
-            <w:fldChar w:fldCharType="end"/>
-          </w:r>
-        </w:p>
-        <w:p>
-          <w:pPr>
-            <w:widowControl w:val="0"/>
-            <w:tabs>
-              <w:tab w:val="right" w:pos="9070"/>
-            </w:tabs>
-            <w:spacing w:before="60" w:line="240" w:lineRule="auto"/>
-            <w:rPr>
-              <w:rFonts w:ascii="Times New Roman" w:eastAsia="Times New Roman" w:hAnsi="Times New Roman" w:cs="Times New Roman"/>
-              <w:color w:val="000000"/>
-              <w:sz w:val="24"/>
-              <w:szCs w:val="24"/>
-            </w:rPr>
-          </w:pPr>
-          <w:hyperlink w:anchor="_heading=h.z337ya">
-            <w:r>
-              <w:rPr>
-                <w:rFonts w:ascii="Times New Roman" w:eastAsia="Times New Roman" w:hAnsi="Times New Roman" w:cs="Times New Roman"/>
-                <w:color w:val="000000"/>
-                <w:sz w:val="24"/>
-                <w:szCs w:val="24"/>
-              </w:rPr>
-              <w:t>Caracteristică personală</w:t>
-            </w:r>
-            <w:r>
-              <w:rPr>
-                <w:rFonts w:ascii="Times New Roman" w:eastAsia="Times New Roman" w:hAnsi="Times New Roman" w:cs="Times New Roman"/>
-                <w:color w:val="000000"/>
-                <w:sz w:val="24"/>
-                <w:szCs w:val="24"/>
-              </w:rPr>
-              <w:tab/>
-            </w:r>
-          </w:hyperlink>
-          <w:r>
-            <w:fldChar w:fldCharType="begin"/>
-          </w:r>
-          <w:r>
-            <w:instrText xml:space="preserve"> PAGEREF _heading=h.z337ya \h </w:instrText>
-          </w:r>
-          <w:r>
-            <w:fldChar w:fldCharType="separate"/>
-          </w:r>
-          <w:r>
-            <w:rPr>
-              <w:rFonts w:ascii="Times New Roman" w:eastAsia="Times New Roman" w:hAnsi="Times New Roman" w:cs="Times New Roman"/>
-              <w:sz w:val="24"/>
-              <w:szCs w:val="24"/>
-            </w:rPr>
-            <w:t>10</w:t>
-          </w:r>
-          <w:r>
-            <w:fldChar w:fldCharType="end"/>
-          </w:r>
-        </w:p>
-        <w:p>
-          <w:pPr>
-            <w:widowControl w:val="0"/>
-            <w:tabs>
-              <w:tab w:val="right" w:pos="9070"/>
-            </w:tabs>
-            <w:spacing w:before="60" w:line="240" w:lineRule="auto"/>
-            <w:rPr>
-              <w:rFonts w:ascii="Times New Roman" w:eastAsia="Times New Roman" w:hAnsi="Times New Roman" w:cs="Times New Roman"/>
-              <w:color w:val="000000"/>
-              <w:sz w:val="24"/>
-              <w:szCs w:val="24"/>
-            </w:rPr>
-          </w:pPr>
-          <w:hyperlink w:anchor="_heading=h.2jxsxqh">
-            <w:r>
-              <w:rPr>
-                <w:rFonts w:ascii="Times New Roman" w:eastAsia="Times New Roman" w:hAnsi="Times New Roman" w:cs="Times New Roman"/>
-                <w:color w:val="000000"/>
-                <w:sz w:val="24"/>
-                <w:szCs w:val="24"/>
-              </w:rPr>
-              <w:t>Observații și propuneri pentru USARB</w:t>
-            </w:r>
-            <w:r>
-              <w:rPr>
-                <w:rFonts w:ascii="Times New Roman" w:eastAsia="Times New Roman" w:hAnsi="Times New Roman" w:cs="Times New Roman"/>
-                <w:color w:val="000000"/>
-                <w:sz w:val="24"/>
-                <w:szCs w:val="24"/>
-              </w:rPr>
-              <w:tab/>
-            </w:r>
-          </w:hyperlink>
-          <w:r>
-            <w:fldChar w:fldCharType="begin"/>
-          </w:r>
-          <w:r>
-            <w:instrText xml:space="preserve"> PAGEREF _heading=h.2jxsxqh \h </w:instrText>
-          </w:r>
-          <w:r>
-            <w:fldChar w:fldCharType="separate"/>
-          </w:r>
-          <w:r>
-            <w:rPr>
-              <w:rFonts w:ascii="Times New Roman" w:eastAsia="Times New Roman" w:hAnsi="Times New Roman" w:cs="Times New Roman"/>
-              <w:sz w:val="24"/>
-              <w:szCs w:val="24"/>
-            </w:rPr>
-            <w:t>11</w:t>
-          </w:r>
-          <w:r>
-            <w:fldChar w:fldCharType="end"/>
-          </w:r>
-          <w:r>
             <w:fldChar w:fldCharType="end"/>
           </w:r>
         </w:p>
@@ -1617,8 +1297,7 @@
           <w:szCs w:val="24"/>
         </w:rPr>
       </w:pPr>
-      <w:bookmarkStart w:id="1" w:name="_heading=h.30j0zll" w:colFirst="0" w:colLast="0"/>
-      <w:bookmarkEnd w:id="1"/>
+      <w:bookmarkStart w:id="1" w:name="_Toc243691414"/>
       <w:r>
         <w:rPr>
           <w:rFonts w:ascii="Times New Roman" w:eastAsia="Times New Roman" w:hAnsi="Times New Roman" w:cs="Times New Roman"/>
@@ -1629,20 +1308,589 @@
         <w:lastRenderedPageBreak/>
         <w:t>Descrierea companiei</w:t>
       </w:r>
-    </w:p>
-    <w:p>
-      <w:pPr>
-        <w:widowControl w:val="0"/>
-        <w:spacing w:before="29" w:line="344" w:lineRule="auto"/>
-        <w:ind w:right="1034"/>
-        <w:jc w:val="center"/>
-        <w:rPr>
-          <w:rFonts w:ascii="Times New Roman" w:eastAsia="Times New Roman" w:hAnsi="Times New Roman" w:cs="Times New Roman"/>
-          <w:b/>
-          <w:sz w:val="24"/>
-          <w:szCs w:val="24"/>
-        </w:rPr>
-      </w:pPr>
+      <w:bookmarkEnd w:id="1"/>
+    </w:p>
+    <w:p/>
+    <w:p>
+      <w:pPr>
+        <w:widowControl w:val="0"/>
+        <w:spacing w:before="29" w:line="344" w:lineRule="auto"/>
+        <w:ind w:right="242"/>
+        <w:jc w:val="both"/>
+        <w:rPr>
+          <w:rFonts w:ascii="Times New Roman" w:eastAsia="Times New Roman" w:hAnsi="Times New Roman" w:cs="Times New Roman"/>
+          <w:sz w:val="24"/>
+          <w:szCs w:val="24"/>
+        </w:rPr>
+      </w:pPr>
+      <w:r>
+        <w:rPr>
+          <w:rFonts w:ascii="Times New Roman" w:eastAsia="Times New Roman" w:hAnsi="Times New Roman" w:cs="Times New Roman"/>
+          <w:sz w:val="24"/>
+          <w:szCs w:val="24"/>
+        </w:rPr>
+        <w:t xml:space="preserve">Direcția Tehnologii Informaționale (DTI) este subdiviziunea Universității de Stat </w:t>
+      </w:r>
+    </w:p>
+    <w:p>
+      <w:pPr>
+        <w:widowControl w:val="0"/>
+        <w:spacing w:before="29" w:line="344" w:lineRule="auto"/>
+        <w:ind w:left="-397" w:right="242"/>
+        <w:jc w:val="both"/>
+        <w:rPr>
+          <w:rFonts w:ascii="Times New Roman" w:eastAsia="Times New Roman" w:hAnsi="Times New Roman" w:cs="Times New Roman"/>
+          <w:sz w:val="24"/>
+          <w:szCs w:val="24"/>
+        </w:rPr>
+      </w:pPr>
+      <w:r>
+        <w:rPr>
+          <w:rFonts w:ascii="Times New Roman" w:eastAsia="Times New Roman" w:hAnsi="Times New Roman" w:cs="Times New Roman"/>
+          <w:sz w:val="24"/>
+          <w:szCs w:val="24"/>
+        </w:rPr>
+        <w:t xml:space="preserve">„Alecu Russo” din Bălți responsabilă de infrastructura informațională a universității. </w:t>
+      </w:r>
+      <w:r>
+        <w:rPr>
+          <w:rFonts w:ascii="Times New Roman" w:eastAsia="Times New Roman" w:hAnsi="Times New Roman" w:cs="Times New Roman"/>
+          <w:sz w:val="24"/>
+          <w:szCs w:val="24"/>
+        </w:rPr>
+        <w:t xml:space="preserve">  </w:t>
+      </w:r>
+      <w:r>
+        <w:rPr>
+          <w:rFonts w:ascii="Times New Roman" w:eastAsia="Times New Roman" w:hAnsi="Times New Roman" w:cs="Times New Roman"/>
+          <w:sz w:val="24"/>
+          <w:szCs w:val="24"/>
+        </w:rPr>
+        <w:t xml:space="preserve">Sediul universității se află pe str. Pușkin, nr. 38, mun. Bălți. Serviciile informatice ale universității sunt folosite zilnic de studenți, cadre didactice și personalul </w:t>
+      </w:r>
+      <w:proofErr w:type="spellStart"/>
+      <w:r>
+        <w:rPr>
+          <w:rFonts w:ascii="Times New Roman" w:eastAsia="Times New Roman" w:hAnsi="Times New Roman" w:cs="Times New Roman"/>
+          <w:sz w:val="24"/>
+          <w:szCs w:val="24"/>
+        </w:rPr>
+        <w:t>administrativ.DTI</w:t>
+      </w:r>
+      <w:proofErr w:type="spellEnd"/>
+      <w:r>
+        <w:rPr>
+          <w:rFonts w:ascii="Times New Roman" w:eastAsia="Times New Roman" w:hAnsi="Times New Roman" w:cs="Times New Roman"/>
+          <w:sz w:val="24"/>
+          <w:szCs w:val="24"/>
+        </w:rPr>
+        <w:t xml:space="preserve"> asigură funcționarea rețelei de calculatoare și a serverelor universității, </w:t>
+      </w:r>
+    </w:p>
+    <w:p>
+      <w:pPr>
+        <w:widowControl w:val="0"/>
+        <w:spacing w:before="29" w:line="344" w:lineRule="auto"/>
+        <w:ind w:left="-397" w:right="242"/>
+        <w:jc w:val="both"/>
+        <w:rPr>
+          <w:rFonts w:ascii="Times New Roman" w:eastAsia="Times New Roman" w:hAnsi="Times New Roman" w:cs="Times New Roman"/>
+          <w:sz w:val="24"/>
+          <w:szCs w:val="24"/>
+        </w:rPr>
+      </w:pPr>
+      <w:r>
+        <w:rPr>
+          <w:rFonts w:ascii="Times New Roman" w:eastAsia="Times New Roman" w:hAnsi="Times New Roman" w:cs="Times New Roman"/>
+          <w:sz w:val="24"/>
+          <w:szCs w:val="24"/>
+        </w:rPr>
+        <w:t xml:space="preserve">administrează site-urile din domeniul usarb.md și dezvoltă aplicațiile informatice folosite de facultăți, secretariate, contabilitate și serviciul resurse </w:t>
+      </w:r>
+      <w:proofErr w:type="spellStart"/>
+      <w:r>
+        <w:rPr>
+          <w:rFonts w:ascii="Times New Roman" w:eastAsia="Times New Roman" w:hAnsi="Times New Roman" w:cs="Times New Roman"/>
+          <w:sz w:val="24"/>
+          <w:szCs w:val="24"/>
+        </w:rPr>
+        <w:t>umane.Pe</w:t>
+      </w:r>
+      <w:proofErr w:type="spellEnd"/>
+      <w:r>
+        <w:rPr>
+          <w:rFonts w:ascii="Times New Roman" w:eastAsia="Times New Roman" w:hAnsi="Times New Roman" w:cs="Times New Roman"/>
+          <w:sz w:val="24"/>
+          <w:szCs w:val="24"/>
+        </w:rPr>
+        <w:t xml:space="preserve"> site-urile universității, studenții și cadrele didactice găsesc informațiile oficiale, </w:t>
+      </w:r>
+    </w:p>
+    <w:p>
+      <w:pPr>
+        <w:widowControl w:val="0"/>
+        <w:spacing w:before="29" w:line="344" w:lineRule="auto"/>
+        <w:ind w:left="-397" w:right="242"/>
+        <w:jc w:val="both"/>
+        <w:rPr>
+          <w:rFonts w:ascii="Times New Roman" w:eastAsia="Times New Roman" w:hAnsi="Times New Roman" w:cs="Times New Roman"/>
+          <w:sz w:val="24"/>
+          <w:szCs w:val="24"/>
+        </w:rPr>
+      </w:pPr>
+      <w:r>
+        <w:rPr>
+          <w:rFonts w:ascii="Times New Roman" w:eastAsia="Times New Roman" w:hAnsi="Times New Roman" w:cs="Times New Roman"/>
+          <w:sz w:val="24"/>
+          <w:szCs w:val="24"/>
+        </w:rPr>
+        <w:t>orarul lecțiilor, cursurile online și publicațiile științifice. Candidații se înscriu la studii prin platforma de admitere online.</w:t>
+      </w:r>
+    </w:p>
+    <w:p>
+      <w:pPr>
+        <w:widowControl w:val="0"/>
+        <w:spacing w:before="29" w:line="344" w:lineRule="auto"/>
+        <w:ind w:left="-397" w:right="242" w:firstLine="850"/>
+        <w:jc w:val="both"/>
+        <w:rPr>
+          <w:rFonts w:ascii="Times New Roman" w:eastAsia="Times New Roman" w:hAnsi="Times New Roman" w:cs="Times New Roman"/>
+          <w:sz w:val="24"/>
+          <w:szCs w:val="24"/>
+        </w:rPr>
+      </w:pPr>
+      <w:r>
+        <w:rPr>
+          <w:rFonts w:ascii="Times New Roman" w:eastAsia="Times New Roman" w:hAnsi="Times New Roman" w:cs="Times New Roman"/>
+          <w:sz w:val="24"/>
+          <w:szCs w:val="24"/>
+        </w:rPr>
+        <w:t>Principalele servicii întreținute de DTI includ:</w:t>
+      </w:r>
+    </w:p>
+    <w:p>
+      <w:pPr>
+        <w:widowControl w:val="0"/>
+        <w:spacing w:before="29" w:line="344" w:lineRule="auto"/>
+        <w:ind w:left="-397" w:right="242" w:firstLine="850"/>
+        <w:jc w:val="both"/>
+        <w:rPr>
+          <w:rFonts w:ascii="Times New Roman" w:eastAsia="Times New Roman" w:hAnsi="Times New Roman" w:cs="Times New Roman"/>
+          <w:sz w:val="24"/>
+          <w:szCs w:val="24"/>
+        </w:rPr>
+      </w:pPr>
+      <w:r>
+        <w:rPr>
+          <w:rFonts w:ascii="Times New Roman" w:eastAsia="Times New Roman" w:hAnsi="Times New Roman" w:cs="Times New Roman"/>
+          <w:sz w:val="24"/>
+          <w:szCs w:val="24"/>
+        </w:rPr>
+        <w:t xml:space="preserve">● Site-ul oficial al universității usarb.md și site-urile facultăților și ale </w:t>
+      </w:r>
+    </w:p>
+    <w:p>
+      <w:pPr>
+        <w:widowControl w:val="0"/>
+        <w:spacing w:before="29" w:line="344" w:lineRule="auto"/>
+        <w:ind w:left="-397" w:right="242" w:firstLine="850"/>
+        <w:jc w:val="both"/>
+        <w:rPr>
+          <w:rFonts w:ascii="Times New Roman" w:eastAsia="Times New Roman" w:hAnsi="Times New Roman" w:cs="Times New Roman"/>
+          <w:sz w:val="24"/>
+          <w:szCs w:val="24"/>
+        </w:rPr>
+      </w:pPr>
+      <w:r>
+        <w:rPr>
+          <w:rFonts w:ascii="Times New Roman" w:eastAsia="Times New Roman" w:hAnsi="Times New Roman" w:cs="Times New Roman"/>
+          <w:sz w:val="24"/>
+          <w:szCs w:val="24"/>
+        </w:rPr>
+        <w:t>subdiviziunilor;</w:t>
+      </w:r>
+    </w:p>
+    <w:p>
+      <w:pPr>
+        <w:widowControl w:val="0"/>
+        <w:spacing w:before="29" w:line="344" w:lineRule="auto"/>
+        <w:ind w:left="-397" w:right="242" w:firstLine="850"/>
+        <w:jc w:val="both"/>
+        <w:rPr>
+          <w:rFonts w:ascii="Times New Roman" w:eastAsia="Times New Roman" w:hAnsi="Times New Roman" w:cs="Times New Roman"/>
+          <w:sz w:val="24"/>
+          <w:szCs w:val="24"/>
+        </w:rPr>
+      </w:pPr>
+      <w:r>
+        <w:rPr>
+          <w:rFonts w:ascii="Times New Roman" w:eastAsia="Times New Roman" w:hAnsi="Times New Roman" w:cs="Times New Roman"/>
+          <w:sz w:val="24"/>
+          <w:szCs w:val="24"/>
+        </w:rPr>
+        <w:t>● Orarul online al lecțiilor orar.usarb.md;</w:t>
+      </w:r>
+    </w:p>
+    <w:p>
+      <w:pPr>
+        <w:widowControl w:val="0"/>
+        <w:spacing w:before="29" w:line="344" w:lineRule="auto"/>
+        <w:ind w:left="-397" w:right="242" w:firstLine="850"/>
+        <w:jc w:val="both"/>
+        <w:rPr>
+          <w:rFonts w:ascii="Times New Roman" w:eastAsia="Times New Roman" w:hAnsi="Times New Roman" w:cs="Times New Roman"/>
+          <w:sz w:val="24"/>
+          <w:szCs w:val="24"/>
+        </w:rPr>
+      </w:pPr>
+      <w:r>
+        <w:rPr>
+          <w:rFonts w:ascii="Times New Roman" w:eastAsia="Times New Roman" w:hAnsi="Times New Roman" w:cs="Times New Roman"/>
+          <w:sz w:val="24"/>
+          <w:szCs w:val="24"/>
+        </w:rPr>
+        <w:t xml:space="preserve">● Platformele de învățare </w:t>
+      </w:r>
+      <w:proofErr w:type="spellStart"/>
+      <w:r>
+        <w:rPr>
+          <w:rFonts w:ascii="Times New Roman" w:eastAsia="Times New Roman" w:hAnsi="Times New Roman" w:cs="Times New Roman"/>
+          <w:sz w:val="24"/>
+          <w:szCs w:val="24"/>
+        </w:rPr>
+        <w:t>Moodle</w:t>
+      </w:r>
+      <w:proofErr w:type="spellEnd"/>
+      <w:r>
+        <w:rPr>
+          <w:rFonts w:ascii="Times New Roman" w:eastAsia="Times New Roman" w:hAnsi="Times New Roman" w:cs="Times New Roman"/>
+          <w:sz w:val="24"/>
+          <w:szCs w:val="24"/>
+        </w:rPr>
+        <w:t xml:space="preserve"> și depozitul instituțional </w:t>
+      </w:r>
+      <w:proofErr w:type="spellStart"/>
+      <w:r>
+        <w:rPr>
+          <w:rFonts w:ascii="Times New Roman" w:eastAsia="Times New Roman" w:hAnsi="Times New Roman" w:cs="Times New Roman"/>
+          <w:sz w:val="24"/>
+          <w:szCs w:val="24"/>
+        </w:rPr>
+        <w:t>DSpace</w:t>
+      </w:r>
+      <w:proofErr w:type="spellEnd"/>
+      <w:r>
+        <w:rPr>
+          <w:rFonts w:ascii="Times New Roman" w:eastAsia="Times New Roman" w:hAnsi="Times New Roman" w:cs="Times New Roman"/>
+          <w:sz w:val="24"/>
+          <w:szCs w:val="24"/>
+        </w:rPr>
+        <w:t>;</w:t>
+      </w:r>
+    </w:p>
+    <w:p>
+      <w:pPr>
+        <w:widowControl w:val="0"/>
+        <w:spacing w:before="29" w:line="344" w:lineRule="auto"/>
+        <w:ind w:left="-397" w:right="242" w:firstLine="850"/>
+        <w:jc w:val="both"/>
+        <w:rPr>
+          <w:rFonts w:ascii="Times New Roman" w:eastAsia="Times New Roman" w:hAnsi="Times New Roman" w:cs="Times New Roman"/>
+          <w:sz w:val="24"/>
+          <w:szCs w:val="24"/>
+        </w:rPr>
+      </w:pPr>
+      <w:r>
+        <w:rPr>
+          <w:rFonts w:ascii="Times New Roman" w:eastAsia="Times New Roman" w:hAnsi="Times New Roman" w:cs="Times New Roman"/>
+          <w:sz w:val="24"/>
+          <w:szCs w:val="24"/>
+        </w:rPr>
+        <w:t>● Platforma de admitere admitere.usarb.md;</w:t>
+      </w:r>
+    </w:p>
+    <w:p>
+      <w:pPr>
+        <w:widowControl w:val="0"/>
+        <w:spacing w:before="29" w:line="344" w:lineRule="auto"/>
+        <w:ind w:left="-397" w:right="242" w:firstLine="850"/>
+        <w:jc w:val="both"/>
+        <w:rPr>
+          <w:rFonts w:ascii="Times New Roman" w:eastAsia="Times New Roman" w:hAnsi="Times New Roman" w:cs="Times New Roman"/>
+          <w:sz w:val="24"/>
+          <w:szCs w:val="24"/>
+        </w:rPr>
+      </w:pPr>
+      <w:r>
+        <w:rPr>
+          <w:rFonts w:ascii="Times New Roman" w:eastAsia="Times New Roman" w:hAnsi="Times New Roman" w:cs="Times New Roman"/>
+          <w:sz w:val="24"/>
+          <w:szCs w:val="24"/>
+        </w:rPr>
+        <w:t>● Aplicațiile interne pentru evidența studenților, a personalului și a plăților;</w:t>
+      </w:r>
+    </w:p>
+    <w:p>
+      <w:pPr>
+        <w:widowControl w:val="0"/>
+        <w:spacing w:before="29" w:line="344" w:lineRule="auto"/>
+        <w:ind w:left="-397" w:right="242" w:firstLine="850"/>
+        <w:jc w:val="both"/>
+        <w:rPr>
+          <w:rFonts w:ascii="Times New Roman" w:eastAsia="Times New Roman" w:hAnsi="Times New Roman" w:cs="Times New Roman"/>
+          <w:sz w:val="24"/>
+          <w:szCs w:val="24"/>
+        </w:rPr>
+      </w:pPr>
+      <w:r>
+        <w:rPr>
+          <w:rFonts w:ascii="Times New Roman" w:eastAsia="Times New Roman" w:hAnsi="Times New Roman" w:cs="Times New Roman"/>
+          <w:sz w:val="24"/>
+          <w:szCs w:val="24"/>
+        </w:rPr>
+        <w:t>● Rețeaua de calculatoare a universității și suportul tehnic pentru angajați.</w:t>
+      </w:r>
+    </w:p>
+    <w:p>
+      <w:pPr>
+        <w:widowControl w:val="0"/>
+        <w:spacing w:before="29" w:line="344" w:lineRule="auto"/>
+        <w:ind w:left="-397" w:right="242" w:firstLine="850"/>
+        <w:jc w:val="both"/>
+        <w:rPr>
+          <w:rFonts w:ascii="Times New Roman" w:eastAsia="Times New Roman" w:hAnsi="Times New Roman" w:cs="Times New Roman"/>
+          <w:sz w:val="24"/>
+          <w:szCs w:val="24"/>
+        </w:rPr>
+      </w:pPr>
+      <w:r>
+        <w:rPr>
+          <w:rFonts w:ascii="Times New Roman" w:eastAsia="Times New Roman" w:hAnsi="Times New Roman" w:cs="Times New Roman"/>
+          <w:sz w:val="24"/>
+          <w:szCs w:val="24"/>
+        </w:rPr>
+        <w:t xml:space="preserve">Sistemul IT funcționează stabil; lucrările curente țin de dezvoltarea aplicațiilor, </w:t>
+      </w:r>
+    </w:p>
+    <w:p>
+      <w:pPr>
+        <w:widowControl w:val="0"/>
+        <w:spacing w:before="29" w:line="344" w:lineRule="auto"/>
+        <w:ind w:left="-397" w:right="242" w:firstLine="850"/>
+        <w:jc w:val="both"/>
+        <w:rPr>
+          <w:rFonts w:ascii="Times New Roman" w:eastAsia="Times New Roman" w:hAnsi="Times New Roman" w:cs="Times New Roman"/>
+          <w:sz w:val="24"/>
+          <w:szCs w:val="24"/>
+        </w:rPr>
+      </w:pPr>
+      <w:r>
+        <w:rPr>
+          <w:rFonts w:ascii="Times New Roman" w:eastAsia="Times New Roman" w:hAnsi="Times New Roman" w:cs="Times New Roman"/>
+          <w:sz w:val="24"/>
+          <w:szCs w:val="24"/>
+        </w:rPr>
+        <w:t>actualizarea site-urilor și a serverelor și suportul tehnic pentru personalul universității.</w:t>
+      </w:r>
+    </w:p>
+    <w:p>
+      <w:pPr>
+        <w:widowControl w:val="0"/>
+        <w:spacing w:before="29" w:line="344" w:lineRule="auto"/>
+        <w:ind w:left="-397" w:right="242" w:firstLine="850"/>
+        <w:jc w:val="both"/>
+        <w:rPr>
+          <w:rFonts w:ascii="Times New Roman" w:eastAsia="Times New Roman" w:hAnsi="Times New Roman" w:cs="Times New Roman"/>
+          <w:b/>
+          <w:bCs/>
+          <w:sz w:val="24"/>
+          <w:szCs w:val="24"/>
+        </w:rPr>
+      </w:pPr>
+    </w:p>
+    <w:p>
+      <w:pPr>
+        <w:widowControl w:val="0"/>
+        <w:spacing w:before="29" w:line="344" w:lineRule="auto"/>
+        <w:ind w:left="-397" w:right="242" w:firstLine="850"/>
+        <w:jc w:val="both"/>
+        <w:rPr>
+          <w:rFonts w:ascii="Times New Roman" w:eastAsia="Times New Roman" w:hAnsi="Times New Roman" w:cs="Times New Roman"/>
+          <w:b/>
+          <w:bCs/>
+          <w:sz w:val="24"/>
+          <w:szCs w:val="24"/>
+        </w:rPr>
+      </w:pPr>
+    </w:p>
+    <w:p>
+      <w:pPr>
+        <w:widowControl w:val="0"/>
+        <w:spacing w:before="29" w:line="344" w:lineRule="auto"/>
+        <w:ind w:right="242" w:firstLine="850"/>
+        <w:jc w:val="right"/>
+        <w:rPr>
+          <w:rFonts w:ascii="Times New Roman" w:eastAsia="Times New Roman" w:hAnsi="Times New Roman" w:cs="Times New Roman"/>
+          <w:b/>
+          <w:bCs/>
+          <w:sz w:val="24"/>
+          <w:szCs w:val="24"/>
+        </w:rPr>
+      </w:pPr>
+      <w:r>
+        <w:rPr>
+          <w:rFonts w:ascii="Times New Roman" w:eastAsia="Times New Roman" w:hAnsi="Times New Roman" w:cs="Times New Roman"/>
+          <w:b/>
+          <w:bCs/>
+          <w:sz w:val="24"/>
+          <w:szCs w:val="24"/>
+        </w:rPr>
+        <w:t>Conducătorul practicii:</w:t>
+      </w:r>
+    </w:p>
+    <w:p>
+      <w:pPr>
+        <w:widowControl w:val="0"/>
+        <w:spacing w:before="29" w:line="344" w:lineRule="auto"/>
+        <w:ind w:right="242" w:firstLine="850"/>
+        <w:jc w:val="right"/>
+        <w:rPr>
+          <w:rFonts w:ascii="Times New Roman" w:eastAsia="Times New Roman" w:hAnsi="Times New Roman" w:cs="Times New Roman"/>
+          <w:sz w:val="24"/>
+          <w:szCs w:val="24"/>
+        </w:rPr>
+      </w:pPr>
+      <w:r>
+        <w:rPr>
+          <w:rFonts w:ascii="Times New Roman" w:eastAsia="Times New Roman" w:hAnsi="Times New Roman" w:cs="Times New Roman"/>
+          <w:sz w:val="24"/>
+          <w:szCs w:val="24"/>
+        </w:rPr>
+        <w:t xml:space="preserve">Nume, Prenume: </w:t>
+      </w:r>
+      <w:proofErr w:type="spellStart"/>
+      <w:r>
+        <w:rPr>
+          <w:rFonts w:ascii="Times New Roman" w:eastAsia="Times New Roman" w:hAnsi="Times New Roman" w:cs="Times New Roman"/>
+          <w:sz w:val="24"/>
+          <w:szCs w:val="24"/>
+        </w:rPr>
+        <w:t>Parahonco</w:t>
+      </w:r>
+      <w:proofErr w:type="spellEnd"/>
+      <w:r>
+        <w:rPr>
+          <w:rFonts w:ascii="Times New Roman" w:eastAsia="Times New Roman" w:hAnsi="Times New Roman" w:cs="Times New Roman"/>
+          <w:sz w:val="24"/>
+          <w:szCs w:val="24"/>
+        </w:rPr>
+        <w:t xml:space="preserve"> Alexandr</w:t>
+      </w:r>
+    </w:p>
+    <w:p>
+      <w:pPr>
+        <w:widowControl w:val="0"/>
+        <w:spacing w:before="29" w:line="344" w:lineRule="auto"/>
+        <w:ind w:right="242" w:firstLine="850"/>
+        <w:jc w:val="right"/>
+        <w:rPr>
+          <w:rFonts w:ascii="Times New Roman" w:eastAsia="Times New Roman" w:hAnsi="Times New Roman" w:cs="Times New Roman"/>
+          <w:sz w:val="24"/>
+          <w:szCs w:val="24"/>
+        </w:rPr>
+      </w:pPr>
+      <w:r>
+        <w:rPr>
+          <w:rFonts w:ascii="Times New Roman" w:eastAsia="Times New Roman" w:hAnsi="Times New Roman" w:cs="Times New Roman"/>
+          <w:sz w:val="24"/>
+          <w:szCs w:val="24"/>
+        </w:rPr>
+        <w:t>Funcția: șef, Direcția Tehnologii Informaționale</w:t>
+      </w:r>
+    </w:p>
+    <w:p>
+      <w:pPr>
+        <w:widowControl w:val="0"/>
+        <w:spacing w:before="29" w:line="344" w:lineRule="auto"/>
+        <w:ind w:right="242" w:firstLine="850"/>
+        <w:jc w:val="right"/>
+        <w:rPr>
+          <w:rFonts w:ascii="Times New Roman" w:eastAsia="Times New Roman" w:hAnsi="Times New Roman" w:cs="Times New Roman"/>
+          <w:sz w:val="24"/>
+          <w:szCs w:val="24"/>
+        </w:rPr>
+      </w:pPr>
+      <w:r>
+        <w:rPr>
+          <w:rFonts w:ascii="Times New Roman" w:eastAsia="Times New Roman" w:hAnsi="Times New Roman" w:cs="Times New Roman"/>
+          <w:sz w:val="24"/>
+          <w:szCs w:val="24"/>
+        </w:rPr>
+        <w:t>Telefon de contact: 0231 52 381</w:t>
+      </w:r>
+    </w:p>
+    <w:p>
+      <w:pPr>
+        <w:widowControl w:val="0"/>
+        <w:spacing w:before="29" w:line="344" w:lineRule="auto"/>
+        <w:ind w:right="242" w:firstLine="850"/>
+        <w:jc w:val="right"/>
+        <w:rPr>
+          <w:rFonts w:ascii="Times New Roman" w:eastAsia="Times New Roman" w:hAnsi="Times New Roman" w:cs="Times New Roman"/>
+          <w:sz w:val="24"/>
+          <w:szCs w:val="24"/>
+        </w:rPr>
+      </w:pPr>
+      <w:r>
+        <w:rPr>
+          <w:rFonts w:ascii="Times New Roman" w:eastAsia="Times New Roman" w:hAnsi="Times New Roman" w:cs="Times New Roman"/>
+          <w:sz w:val="24"/>
+          <w:szCs w:val="24"/>
+        </w:rPr>
+        <w:t>Adresa de e-mail: alexandr.parahonco@usarb.md</w:t>
+      </w:r>
+    </w:p>
+    <w:p>
+      <w:pPr>
+        <w:widowControl w:val="0"/>
+        <w:spacing w:before="29" w:line="344" w:lineRule="auto"/>
+        <w:ind w:right="242" w:firstLine="850"/>
+        <w:jc w:val="right"/>
+        <w:rPr>
+          <w:rFonts w:ascii="Times New Roman" w:eastAsia="Times New Roman" w:hAnsi="Times New Roman" w:cs="Times New Roman"/>
+          <w:sz w:val="24"/>
+          <w:szCs w:val="24"/>
+        </w:rPr>
+      </w:pPr>
+      <w:r>
+        <w:rPr>
+          <w:rFonts w:ascii="Times New Roman" w:eastAsia="Times New Roman" w:hAnsi="Times New Roman" w:cs="Times New Roman"/>
+          <w:sz w:val="24"/>
+          <w:szCs w:val="24"/>
+        </w:rPr>
+        <w:t>Semnătura</w:t>
+      </w:r>
+    </w:p>
+    <w:p>
+      <w:pPr>
+        <w:widowControl w:val="0"/>
+        <w:spacing w:before="29" w:line="344" w:lineRule="auto"/>
+        <w:ind w:right="242" w:firstLine="850"/>
+        <w:jc w:val="right"/>
+        <w:rPr>
+          <w:rFonts w:ascii="Times New Roman" w:eastAsia="Times New Roman" w:hAnsi="Times New Roman" w:cs="Times New Roman"/>
+          <w:sz w:val="24"/>
+          <w:szCs w:val="24"/>
+        </w:rPr>
+      </w:pPr>
+      <w:r>
+        <w:rPr>
+          <w:rFonts w:ascii="Times New Roman" w:eastAsia="Times New Roman" w:hAnsi="Times New Roman" w:cs="Times New Roman"/>
+          <w:sz w:val="24"/>
+          <w:szCs w:val="24"/>
+        </w:rPr>
+        <w:t>___________</w:t>
+      </w:r>
     </w:p>
     <w:p>
       <w:pPr>
@@ -1656,32 +1904,6 @@
           <w:szCs w:val="24"/>
         </w:rPr>
       </w:pPr>
-      <w:r>
-        <w:rPr>
-          <w:rFonts w:ascii="Times New Roman" w:eastAsia="Times New Roman" w:hAnsi="Times New Roman" w:cs="Times New Roman"/>
-          <w:sz w:val="24"/>
-          <w:szCs w:val="24"/>
-        </w:rPr>
-        <w:t xml:space="preserve">Compania SRL ”DENUMIRE” se ocupă cu repararea tehnicii de calcul și alte tehnici de uz casnic, comercializarea componentelor a calculatoarelor și altele. Având </w:t>
-      </w:r>
-      <w:proofErr w:type="spellStart"/>
-      <w:r>
-        <w:rPr>
-          <w:rFonts w:ascii="Times New Roman" w:eastAsia="Times New Roman" w:hAnsi="Times New Roman" w:cs="Times New Roman"/>
-          <w:sz w:val="24"/>
-          <w:szCs w:val="24"/>
-        </w:rPr>
-        <w:t>staj</w:t>
-      </w:r>
-      <w:proofErr w:type="spellEnd"/>
-      <w:r>
-        <w:rPr>
-          <w:rFonts w:ascii="Times New Roman" w:eastAsia="Times New Roman" w:hAnsi="Times New Roman" w:cs="Times New Roman"/>
-          <w:sz w:val="24"/>
-          <w:szCs w:val="24"/>
-        </w:rPr>
-        <w:t xml:space="preserve"> de peste 16 ani poate repara diverse defecte la diverse tipuri de tehnică, consultă clienții și dă sfaturi pentru a evita pe viitor așa defecte..</w:t>
-      </w:r>
     </w:p>
     <w:p>
       <w:pPr>
@@ -1695,14 +1917,6 @@
           <w:szCs w:val="24"/>
         </w:rPr>
       </w:pPr>
-      <w:r>
-        <w:rPr>
-          <w:rFonts w:ascii="Times New Roman" w:eastAsia="Times New Roman" w:hAnsi="Times New Roman" w:cs="Times New Roman"/>
-          <w:sz w:val="24"/>
-          <w:szCs w:val="24"/>
-        </w:rPr>
-        <w:t xml:space="preserve">SRL ”OURENSE” dispune de 5 calculatoare pe care se utilizează în fiecare zi. Primul calculator este la recepție care face managementul de comenzi de la clienți către întreprindere și duce evidența a depozitului, face comenzi dacă vreo componentă care este nevoie lipsește. </w:t>
-      </w:r>
     </w:p>
     <w:p>
       <w:pPr>
@@ -1716,14 +1930,6 @@
           <w:szCs w:val="24"/>
         </w:rPr>
       </w:pPr>
-      <w:r>
-        <w:rPr>
-          <w:rFonts w:ascii="Times New Roman" w:eastAsia="Times New Roman" w:hAnsi="Times New Roman" w:cs="Times New Roman"/>
-          <w:sz w:val="24"/>
-          <w:szCs w:val="24"/>
-        </w:rPr>
-        <w:t>Celelalte 4 calculatoare se află în zona de reparare a calculatoarelor și servesc pentru testarea diferitor componente a calculatoarelor, testarea hard discurilor pentru a se asigura că el funcționează bine și nu are sectoare deteriorate, testarea plăcilor video, memoriei operative și altor componente.</w:t>
-      </w:r>
     </w:p>
     <w:p>
       <w:pPr>
@@ -1737,157 +1943,6 @@
           <w:szCs w:val="24"/>
         </w:rPr>
       </w:pPr>
-      <w:r>
-        <w:rPr>
-          <w:rFonts w:ascii="Times New Roman" w:eastAsia="Times New Roman" w:hAnsi="Times New Roman" w:cs="Times New Roman"/>
-          <w:sz w:val="24"/>
-          <w:szCs w:val="24"/>
-        </w:rPr>
-        <w:t>Calculatoarele au următoarele caracteristici:</w:t>
-      </w:r>
-    </w:p>
-    <w:p>
-      <w:pPr>
-        <w:widowControl w:val="0"/>
-        <w:numPr>
-          <w:ilvl w:val="0"/>
-          <w:numId w:val="4"/>
-        </w:numPr>
-        <w:spacing w:before="29" w:line="344" w:lineRule="auto"/>
-        <w:ind w:right="242" w:firstLine="130"/>
-        <w:jc w:val="both"/>
-        <w:rPr>
-          <w:rFonts w:ascii="Times New Roman" w:eastAsia="Times New Roman" w:hAnsi="Times New Roman" w:cs="Times New Roman"/>
-          <w:sz w:val="24"/>
-          <w:szCs w:val="24"/>
-        </w:rPr>
-      </w:pPr>
-      <w:r>
-        <w:rPr>
-          <w:rFonts w:ascii="Times New Roman" w:eastAsia="Times New Roman" w:hAnsi="Times New Roman" w:cs="Times New Roman"/>
-          <w:sz w:val="24"/>
-          <w:szCs w:val="24"/>
-        </w:rPr>
-        <w:t>Procesor: Intel Core i5-3470 3.20GHz</w:t>
-      </w:r>
-    </w:p>
-    <w:p>
-      <w:pPr>
-        <w:widowControl w:val="0"/>
-        <w:numPr>
-          <w:ilvl w:val="0"/>
-          <w:numId w:val="4"/>
-        </w:numPr>
-        <w:spacing w:line="344" w:lineRule="auto"/>
-        <w:ind w:right="242" w:firstLine="130"/>
-        <w:jc w:val="both"/>
-        <w:rPr>
-          <w:rFonts w:ascii="Times New Roman" w:eastAsia="Times New Roman" w:hAnsi="Times New Roman" w:cs="Times New Roman"/>
-          <w:sz w:val="24"/>
-          <w:szCs w:val="24"/>
-        </w:rPr>
-      </w:pPr>
-      <w:r>
-        <w:rPr>
-          <w:rFonts w:ascii="Times New Roman" w:eastAsia="Times New Roman" w:hAnsi="Times New Roman" w:cs="Times New Roman"/>
-          <w:sz w:val="24"/>
-          <w:szCs w:val="24"/>
-        </w:rPr>
-        <w:t>Memorie operativă: 8GB DDR-3</w:t>
-      </w:r>
-    </w:p>
-    <w:p>
-      <w:pPr>
-        <w:widowControl w:val="0"/>
-        <w:numPr>
-          <w:ilvl w:val="0"/>
-          <w:numId w:val="4"/>
-        </w:numPr>
-        <w:spacing w:line="344" w:lineRule="auto"/>
-        <w:ind w:right="242" w:firstLine="130"/>
-        <w:jc w:val="both"/>
-        <w:rPr>
-          <w:rFonts w:ascii="Times New Roman" w:eastAsia="Times New Roman" w:hAnsi="Times New Roman" w:cs="Times New Roman"/>
-          <w:sz w:val="24"/>
-          <w:szCs w:val="24"/>
-        </w:rPr>
-      </w:pPr>
-      <w:r>
-        <w:rPr>
-          <w:rFonts w:ascii="Times New Roman" w:eastAsia="Times New Roman" w:hAnsi="Times New Roman" w:cs="Times New Roman"/>
-          <w:sz w:val="24"/>
-          <w:szCs w:val="24"/>
-        </w:rPr>
-        <w:t xml:space="preserve">Placă de bază:  X7-V121 </w:t>
-      </w:r>
-      <w:proofErr w:type="spellStart"/>
-      <w:r>
-        <w:rPr>
-          <w:rFonts w:ascii="Times New Roman" w:eastAsia="Times New Roman" w:hAnsi="Times New Roman" w:cs="Times New Roman"/>
-          <w:sz w:val="24"/>
-          <w:szCs w:val="24"/>
-        </w:rPr>
-        <w:t>socket</w:t>
-      </w:r>
-      <w:proofErr w:type="spellEnd"/>
-      <w:r>
-        <w:rPr>
-          <w:rFonts w:ascii="Times New Roman" w:eastAsia="Times New Roman" w:hAnsi="Times New Roman" w:cs="Times New Roman"/>
-          <w:sz w:val="24"/>
-          <w:szCs w:val="24"/>
-        </w:rPr>
-        <w:t xml:space="preserve"> 1155 chipset Intel H61</w:t>
-      </w:r>
-    </w:p>
-    <w:p>
-      <w:pPr>
-        <w:widowControl w:val="0"/>
-        <w:numPr>
-          <w:ilvl w:val="0"/>
-          <w:numId w:val="4"/>
-        </w:numPr>
-        <w:spacing w:line="344" w:lineRule="auto"/>
-        <w:ind w:right="242" w:firstLine="130"/>
-        <w:jc w:val="both"/>
-        <w:rPr>
-          <w:rFonts w:ascii="Times New Roman" w:eastAsia="Times New Roman" w:hAnsi="Times New Roman" w:cs="Times New Roman"/>
-          <w:sz w:val="24"/>
-          <w:szCs w:val="24"/>
-        </w:rPr>
-      </w:pPr>
-      <w:r>
-        <w:rPr>
-          <w:rFonts w:ascii="Times New Roman" w:eastAsia="Times New Roman" w:hAnsi="Times New Roman" w:cs="Times New Roman"/>
-          <w:sz w:val="24"/>
-          <w:szCs w:val="24"/>
-        </w:rPr>
-        <w:t>Case: DEEPCOOL "WAVE V2" Micro-ATX Case</w:t>
-      </w:r>
-    </w:p>
-    <w:p>
-      <w:pPr>
-        <w:widowControl w:val="0"/>
-        <w:numPr>
-          <w:ilvl w:val="0"/>
-          <w:numId w:val="4"/>
-        </w:numPr>
-        <w:spacing w:line="344" w:lineRule="auto"/>
-        <w:ind w:right="242" w:firstLine="130"/>
-        <w:jc w:val="both"/>
-        <w:rPr>
-          <w:rFonts w:ascii="Times New Roman" w:eastAsia="Times New Roman" w:hAnsi="Times New Roman" w:cs="Times New Roman"/>
-          <w:sz w:val="24"/>
-          <w:szCs w:val="24"/>
-        </w:rPr>
-      </w:pPr>
-      <w:r>
-        <w:rPr>
-          <w:rFonts w:ascii="Times New Roman" w:eastAsia="Times New Roman" w:hAnsi="Times New Roman" w:cs="Times New Roman"/>
-          <w:sz w:val="24"/>
-          <w:szCs w:val="24"/>
-        </w:rPr>
-        <w:t>Bloc de alimentare:  XILENCE XP500R7, 500W</w:t>
-      </w:r>
     </w:p>
     <w:p>
       <w:pPr>
@@ -1901,266 +1956,6 @@
           <w:szCs w:val="24"/>
         </w:rPr>
       </w:pPr>
-      <w:r>
-        <w:rPr>
-          <w:rFonts w:ascii="Times New Roman" w:eastAsia="Times New Roman" w:hAnsi="Times New Roman" w:cs="Times New Roman"/>
-          <w:sz w:val="24"/>
-          <w:szCs w:val="24"/>
-        </w:rPr>
-        <w:t>Sistemul IT nu întâmpină probleme în timpul lucrului, este bine stabilizat.</w:t>
-      </w:r>
-    </w:p>
-    <w:p>
-      <w:pPr>
-        <w:widowControl w:val="0"/>
-        <w:spacing w:before="29" w:line="344" w:lineRule="auto"/>
-        <w:ind w:right="242" w:firstLine="850"/>
-        <w:rPr>
-          <w:rFonts w:ascii="Times New Roman" w:eastAsia="Times New Roman" w:hAnsi="Times New Roman" w:cs="Times New Roman"/>
-          <w:sz w:val="24"/>
-          <w:szCs w:val="24"/>
-        </w:rPr>
-      </w:pPr>
-    </w:p>
-    <w:p>
-      <w:pPr>
-        <w:widowControl w:val="0"/>
-        <w:spacing w:before="29" w:line="344" w:lineRule="auto"/>
-        <w:ind w:right="242" w:firstLine="850"/>
-        <w:rPr>
-          <w:rFonts w:ascii="Times New Roman" w:eastAsia="Times New Roman" w:hAnsi="Times New Roman" w:cs="Times New Roman"/>
-          <w:sz w:val="24"/>
-          <w:szCs w:val="24"/>
-        </w:rPr>
-      </w:pPr>
-    </w:p>
-    <w:p>
-      <w:pPr>
-        <w:widowControl w:val="0"/>
-        <w:spacing w:before="29" w:line="344" w:lineRule="auto"/>
-        <w:ind w:right="240" w:firstLine="850"/>
-        <w:jc w:val="right"/>
-        <w:rPr>
-          <w:rFonts w:ascii="Times New Roman" w:eastAsia="Times New Roman" w:hAnsi="Times New Roman" w:cs="Times New Roman"/>
-          <w:b/>
-          <w:sz w:val="24"/>
-          <w:szCs w:val="24"/>
-        </w:rPr>
-      </w:pPr>
-      <w:r>
-        <w:rPr>
-          <w:rFonts w:ascii="Times New Roman" w:eastAsia="Times New Roman" w:hAnsi="Times New Roman" w:cs="Times New Roman"/>
-          <w:b/>
-          <w:sz w:val="24"/>
-          <w:szCs w:val="24"/>
-        </w:rPr>
-        <w:t>Conducătorul practicii:</w:t>
-      </w:r>
-    </w:p>
-    <w:p>
-      <w:pPr>
-        <w:widowControl w:val="0"/>
-        <w:spacing w:before="29" w:line="344" w:lineRule="auto"/>
-        <w:ind w:right="240" w:firstLine="850"/>
-        <w:jc w:val="right"/>
-        <w:rPr>
-          <w:rFonts w:ascii="Times New Roman" w:eastAsia="Times New Roman" w:hAnsi="Times New Roman" w:cs="Times New Roman"/>
-          <w:sz w:val="24"/>
-          <w:szCs w:val="24"/>
-        </w:rPr>
-      </w:pPr>
-      <w:r>
-        <w:rPr>
-          <w:rFonts w:ascii="Times New Roman" w:eastAsia="Times New Roman" w:hAnsi="Times New Roman" w:cs="Times New Roman"/>
-          <w:sz w:val="24"/>
-          <w:szCs w:val="24"/>
-        </w:rPr>
-        <w:t xml:space="preserve">Nume, Prenume: Sergiu </w:t>
-      </w:r>
-      <w:proofErr w:type="spellStart"/>
-      <w:r>
-        <w:rPr>
-          <w:rFonts w:ascii="Times New Roman" w:eastAsia="Times New Roman" w:hAnsi="Times New Roman" w:cs="Times New Roman"/>
-          <w:sz w:val="24"/>
-          <w:szCs w:val="24"/>
-        </w:rPr>
-        <w:t>Chilat</w:t>
-      </w:r>
-      <w:proofErr w:type="spellEnd"/>
-      <w:r>
-        <w:rPr>
-          <w:rFonts w:ascii="Times New Roman" w:eastAsia="Times New Roman" w:hAnsi="Times New Roman" w:cs="Times New Roman"/>
-          <w:sz w:val="24"/>
-          <w:szCs w:val="24"/>
-        </w:rPr>
-        <w:t xml:space="preserve"> </w:t>
-      </w:r>
-    </w:p>
-    <w:p>
-      <w:pPr>
-        <w:ind w:left="1440" w:right="240"/>
-        <w:jc w:val="right"/>
-        <w:rPr>
-          <w:rFonts w:ascii="Times New Roman" w:eastAsia="Times New Roman" w:hAnsi="Times New Roman" w:cs="Times New Roman"/>
-          <w:sz w:val="24"/>
-          <w:szCs w:val="24"/>
-        </w:rPr>
-      </w:pPr>
-      <w:r>
-        <w:rPr>
-          <w:rFonts w:ascii="Times New Roman" w:eastAsia="Times New Roman" w:hAnsi="Times New Roman" w:cs="Times New Roman"/>
-          <w:sz w:val="24"/>
-          <w:szCs w:val="24"/>
-        </w:rPr>
-        <w:t xml:space="preserve">Funcția: administrator </w:t>
-      </w:r>
-    </w:p>
-    <w:p>
-      <w:pPr>
-        <w:ind w:left="1440" w:right="240"/>
-        <w:jc w:val="right"/>
-        <w:rPr>
-          <w:rFonts w:ascii="Times New Roman" w:eastAsia="Times New Roman" w:hAnsi="Times New Roman" w:cs="Times New Roman"/>
-          <w:sz w:val="24"/>
-          <w:szCs w:val="24"/>
-        </w:rPr>
-      </w:pPr>
-      <w:r>
-        <w:rPr>
-          <w:rFonts w:ascii="Times New Roman" w:eastAsia="Times New Roman" w:hAnsi="Times New Roman" w:cs="Times New Roman"/>
-          <w:sz w:val="24"/>
-          <w:szCs w:val="24"/>
-        </w:rPr>
-        <w:t>Telefon de contact: +37360333284</w:t>
-      </w:r>
-    </w:p>
-    <w:p>
-      <w:pPr>
-        <w:ind w:left="1440" w:right="240"/>
-        <w:jc w:val="right"/>
-        <w:rPr>
-          <w:rFonts w:ascii="Times New Roman" w:eastAsia="Times New Roman" w:hAnsi="Times New Roman" w:cs="Times New Roman"/>
-          <w:sz w:val="24"/>
-          <w:szCs w:val="24"/>
-        </w:rPr>
-      </w:pPr>
-      <w:r>
-        <w:rPr>
-          <w:rFonts w:ascii="Times New Roman" w:eastAsia="Times New Roman" w:hAnsi="Times New Roman" w:cs="Times New Roman"/>
-          <w:sz w:val="24"/>
-          <w:szCs w:val="24"/>
-        </w:rPr>
-        <w:t xml:space="preserve">Adresa de e-mail: </w:t>
-      </w:r>
-      <w:hyperlink r:id="rId8">
-        <w:r>
-          <w:rPr>
-            <w:rFonts w:ascii="Times New Roman" w:eastAsia="Times New Roman" w:hAnsi="Times New Roman" w:cs="Times New Roman"/>
-            <w:color w:val="1155CC"/>
-            <w:sz w:val="24"/>
-            <w:szCs w:val="24"/>
-            <w:u w:val="single"/>
-          </w:rPr>
-          <w:t>chilatsergiu@gmail.com</w:t>
-        </w:r>
-      </w:hyperlink>
-    </w:p>
-    <w:p>
-      <w:pPr>
-        <w:ind w:left="720" w:right="240"/>
-        <w:jc w:val="right"/>
-        <w:rPr>
-          <w:rFonts w:ascii="Times New Roman" w:eastAsia="Times New Roman" w:hAnsi="Times New Roman" w:cs="Times New Roman"/>
-          <w:sz w:val="24"/>
-          <w:szCs w:val="24"/>
-        </w:rPr>
-      </w:pPr>
-      <w:r>
-        <w:rPr>
-          <w:rFonts w:ascii="Times New Roman" w:eastAsia="Times New Roman" w:hAnsi="Times New Roman" w:cs="Times New Roman"/>
-          <w:sz w:val="24"/>
-          <w:szCs w:val="24"/>
-        </w:rPr>
-        <w:t>Semnătura</w:t>
-      </w:r>
-    </w:p>
-    <w:p>
-      <w:pPr>
-        <w:ind w:left="720" w:right="240"/>
-        <w:jc w:val="right"/>
-        <w:rPr>
-          <w:rFonts w:ascii="Times New Roman" w:eastAsia="Times New Roman" w:hAnsi="Times New Roman" w:cs="Times New Roman"/>
-          <w:sz w:val="24"/>
-          <w:szCs w:val="24"/>
-        </w:rPr>
-      </w:pPr>
-    </w:p>
-    <w:p>
-      <w:pPr>
-        <w:ind w:left="720" w:right="240"/>
-        <w:jc w:val="right"/>
-        <w:rPr>
-          <w:rFonts w:ascii="Times New Roman" w:eastAsia="Times New Roman" w:hAnsi="Times New Roman" w:cs="Times New Roman"/>
-          <w:sz w:val="24"/>
-          <w:szCs w:val="24"/>
-        </w:rPr>
-      </w:pPr>
-      <w:r>
-        <w:rPr>
-          <w:rFonts w:ascii="Times New Roman" w:eastAsia="Times New Roman" w:hAnsi="Times New Roman" w:cs="Times New Roman"/>
-          <w:sz w:val="24"/>
-          <w:szCs w:val="24"/>
-        </w:rPr>
-        <w:t>____________</w:t>
-      </w:r>
-    </w:p>
-    <w:p>
-      <w:pPr>
-        <w:widowControl w:val="0"/>
-        <w:spacing w:before="29" w:line="344" w:lineRule="auto"/>
-        <w:ind w:right="242"/>
-        <w:rPr>
-          <w:rFonts w:ascii="Times New Roman" w:eastAsia="Times New Roman" w:hAnsi="Times New Roman" w:cs="Times New Roman"/>
-          <w:sz w:val="24"/>
-          <w:szCs w:val="24"/>
-        </w:rPr>
-      </w:pPr>
-    </w:p>
-    <w:p>
-      <w:pPr>
-        <w:widowControl w:val="0"/>
-        <w:spacing w:before="29" w:line="344" w:lineRule="auto"/>
-        <w:ind w:right="242"/>
-        <w:rPr>
-          <w:rFonts w:ascii="Times New Roman" w:eastAsia="Times New Roman" w:hAnsi="Times New Roman" w:cs="Times New Roman"/>
-          <w:sz w:val="24"/>
-          <w:szCs w:val="24"/>
-        </w:rPr>
-      </w:pPr>
-    </w:p>
-    <w:p>
-      <w:pPr>
-        <w:widowControl w:val="0"/>
-        <w:spacing w:before="29" w:line="344" w:lineRule="auto"/>
-        <w:ind w:right="242"/>
-        <w:rPr>
-          <w:rFonts w:ascii="Times New Roman" w:eastAsia="Times New Roman" w:hAnsi="Times New Roman" w:cs="Times New Roman"/>
-          <w:sz w:val="24"/>
-          <w:szCs w:val="24"/>
-        </w:rPr>
-      </w:pPr>
-    </w:p>
-    <w:p>
-      <w:pPr>
-        <w:widowControl w:val="0"/>
-        <w:spacing w:before="29" w:line="344" w:lineRule="auto"/>
-        <w:ind w:right="242"/>
-        <w:rPr>
-          <w:rFonts w:ascii="Times New Roman" w:eastAsia="Times New Roman" w:hAnsi="Times New Roman" w:cs="Times New Roman"/>
-          <w:sz w:val="24"/>
-          <w:szCs w:val="24"/>
-        </w:rPr>
-      </w:pPr>
     </w:p>
     <w:p>
       <w:pPr>
@@ -2175,17 +1970,9 @@
           <w:szCs w:val="24"/>
         </w:rPr>
       </w:pPr>
-      <w:r>
-        <w:br w:type="page"/>
-      </w:r>
-    </w:p>
-    <w:p>
-      <w:pPr>
-        <w:pStyle w:val="Titlu1"/>
-        <w:widowControl w:val="0"/>
-        <w:spacing w:before="29" w:line="344" w:lineRule="auto"/>
-        <w:ind w:right="4"/>
-        <w:jc w:val="center"/>
+      <w:bookmarkStart w:id="2" w:name="_Toc243691415"/>
+      <w:proofErr w:type="spellStart"/>
+      <w:r>
         <w:rPr>
           <w:rFonts w:ascii="Times New Roman" w:eastAsia="Times New Roman" w:hAnsi="Times New Roman" w:cs="Times New Roman"/>
           <w:b/>
@@ -2194,8 +1981,10 @@
           <w:szCs w:val="28"/>
           <w:lang w:val="en-US"/>
         </w:rPr>
-      </w:pPr>
-      <w:proofErr w:type="spellStart"/>
+        <w:lastRenderedPageBreak/>
+        <w:t>Descreierea</w:t>
+      </w:r>
+      <w:proofErr w:type="spellEnd"/>
       <w:r>
         <w:rPr>
           <w:rFonts w:ascii="Times New Roman" w:eastAsia="Times New Roman" w:hAnsi="Times New Roman" w:cs="Times New Roman"/>
@@ -2205,10 +1994,9 @@
           <w:szCs w:val="28"/>
           <w:lang w:val="en-US"/>
         </w:rPr>
-        <w:lastRenderedPageBreak/>
-        <w:t>Descreierea</w:t>
-      </w:r>
-      <w:proofErr w:type="spellEnd"/>
+        <w:t xml:space="preserve"> </w:t>
+      </w:r>
+      <w:proofErr w:type="spellStart"/>
       <w:r>
         <w:rPr>
           <w:rFonts w:ascii="Times New Roman" w:eastAsia="Times New Roman" w:hAnsi="Times New Roman" w:cs="Times New Roman"/>
@@ -2218,9 +2006,9 @@
           <w:szCs w:val="28"/>
           <w:lang w:val="en-US"/>
         </w:rPr>
-        <w:t xml:space="preserve"> </w:t>
-      </w:r>
-      <w:proofErr w:type="spellStart"/>
+        <w:t>proiectului</w:t>
+      </w:r>
+      <w:proofErr w:type="spellEnd"/>
       <w:r>
         <w:rPr>
           <w:rFonts w:ascii="Times New Roman" w:eastAsia="Times New Roman" w:hAnsi="Times New Roman" w:cs="Times New Roman"/>
@@ -2230,9 +2018,8 @@
           <w:szCs w:val="28"/>
           <w:lang w:val="en-US"/>
         </w:rPr>
-        <w:t>proiectului</w:t>
-      </w:r>
-      <w:proofErr w:type="spellEnd"/>
+        <w:t>:</w:t>
+      </w:r>
       <w:r>
         <w:rPr>
           <w:rFonts w:ascii="Times New Roman" w:eastAsia="Times New Roman" w:hAnsi="Times New Roman" w:cs="Times New Roman"/>
@@ -2242,8 +2029,9 @@
           <w:szCs w:val="28"/>
           <w:lang w:val="en-US"/>
         </w:rPr>
-        <w:t>:</w:t>
-      </w:r>
+        <w:br/>
+      </w:r>
+      <w:proofErr w:type="spellStart"/>
       <w:r>
         <w:rPr>
           <w:rFonts w:ascii="Times New Roman" w:eastAsia="Times New Roman" w:hAnsi="Times New Roman" w:cs="Times New Roman"/>
@@ -2253,9 +2041,9 @@
           <w:szCs w:val="28"/>
           <w:lang w:val="en-US"/>
         </w:rPr>
-        <w:br/>
-      </w:r>
-      <w:proofErr w:type="spellStart"/>
+        <w:t>Dezvoltarea</w:t>
+      </w:r>
+      <w:proofErr w:type="spellEnd"/>
       <w:r>
         <w:rPr>
           <w:rFonts w:ascii="Times New Roman" w:eastAsia="Times New Roman" w:hAnsi="Times New Roman" w:cs="Times New Roman"/>
@@ -2265,9 +2053,9 @@
           <w:szCs w:val="28"/>
           <w:lang w:val="en-US"/>
         </w:rPr>
-        <w:t>Dezvoltarea</w:t>
-      </w:r>
-      <w:proofErr w:type="spellEnd"/>
+        <w:t xml:space="preserve"> </w:t>
+      </w:r>
+      <w:proofErr w:type="spellStart"/>
       <w:r>
         <w:rPr>
           <w:rFonts w:ascii="Times New Roman" w:eastAsia="Times New Roman" w:hAnsi="Times New Roman" w:cs="Times New Roman"/>
@@ -2277,9 +2065,9 @@
           <w:szCs w:val="28"/>
           <w:lang w:val="en-US"/>
         </w:rPr>
-        <w:t xml:space="preserve"> </w:t>
-      </w:r>
-      <w:proofErr w:type="spellStart"/>
+        <w:t>unui</w:t>
+      </w:r>
+      <w:proofErr w:type="spellEnd"/>
       <w:r>
         <w:rPr>
           <w:rFonts w:ascii="Times New Roman" w:eastAsia="Times New Roman" w:hAnsi="Times New Roman" w:cs="Times New Roman"/>
@@ -2289,9 +2077,9 @@
           <w:szCs w:val="28"/>
           <w:lang w:val="en-US"/>
         </w:rPr>
-        <w:t>unui</w:t>
-      </w:r>
-      <w:proofErr w:type="spellEnd"/>
+        <w:t xml:space="preserve"> </w:t>
+      </w:r>
+      <w:proofErr w:type="spellStart"/>
       <w:r>
         <w:rPr>
           <w:rFonts w:ascii="Times New Roman" w:eastAsia="Times New Roman" w:hAnsi="Times New Roman" w:cs="Times New Roman"/>
@@ -2301,9 +2089,9 @@
           <w:szCs w:val="28"/>
           <w:lang w:val="en-US"/>
         </w:rPr>
-        <w:t xml:space="preserve"> </w:t>
-      </w:r>
-      <w:proofErr w:type="spellStart"/>
+        <w:t>Sistem</w:t>
+      </w:r>
+      <w:proofErr w:type="spellEnd"/>
       <w:r>
         <w:rPr>
           <w:rFonts w:ascii="Times New Roman" w:eastAsia="Times New Roman" w:hAnsi="Times New Roman" w:cs="Times New Roman"/>
@@ -2313,9 +2101,9 @@
           <w:szCs w:val="28"/>
           <w:lang w:val="en-US"/>
         </w:rPr>
-        <w:t>Sistem</w:t>
-      </w:r>
-      <w:proofErr w:type="spellEnd"/>
+        <w:t xml:space="preserve"> de </w:t>
+      </w:r>
+      <w:proofErr w:type="spellStart"/>
       <w:r>
         <w:rPr>
           <w:rFonts w:ascii="Times New Roman" w:eastAsia="Times New Roman" w:hAnsi="Times New Roman" w:cs="Times New Roman"/>
@@ -2325,9 +2113,9 @@
           <w:szCs w:val="28"/>
           <w:lang w:val="en-US"/>
         </w:rPr>
-        <w:t xml:space="preserve"> de </w:t>
-      </w:r>
-      <w:proofErr w:type="spellStart"/>
+        <w:t>Traducere</w:t>
+      </w:r>
+      <w:proofErr w:type="spellEnd"/>
       <w:r>
         <w:rPr>
           <w:rFonts w:ascii="Times New Roman" w:eastAsia="Times New Roman" w:hAnsi="Times New Roman" w:cs="Times New Roman"/>
@@ -2337,9 +2125,9 @@
           <w:szCs w:val="28"/>
           <w:lang w:val="en-US"/>
         </w:rPr>
-        <w:t>Traducere</w:t>
-      </w:r>
-      <w:proofErr w:type="spellEnd"/>
+        <w:t xml:space="preserve"> </w:t>
+      </w:r>
+      <w:proofErr w:type="spellStart"/>
       <w:r>
         <w:rPr>
           <w:rFonts w:ascii="Times New Roman" w:eastAsia="Times New Roman" w:hAnsi="Times New Roman" w:cs="Times New Roman"/>
@@ -2349,9 +2137,9 @@
           <w:szCs w:val="28"/>
           <w:lang w:val="en-US"/>
         </w:rPr>
-        <w:t xml:space="preserve"> </w:t>
-      </w:r>
-      <w:proofErr w:type="spellStart"/>
+        <w:t>Automată</w:t>
+      </w:r>
+      <w:proofErr w:type="spellEnd"/>
       <w:r>
         <w:rPr>
           <w:rFonts w:ascii="Times New Roman" w:eastAsia="Times New Roman" w:hAnsi="Times New Roman" w:cs="Times New Roman"/>
@@ -2361,9 +2149,9 @@
           <w:szCs w:val="28"/>
           <w:lang w:val="en-US"/>
         </w:rPr>
-        <w:t>Automată</w:t>
-      </w:r>
-      <w:proofErr w:type="spellEnd"/>
+        <w:t xml:space="preserve"> </w:t>
+      </w:r>
+      <w:proofErr w:type="spellStart"/>
       <w:r>
         <w:rPr>
           <w:rFonts w:ascii="Times New Roman" w:eastAsia="Times New Roman" w:hAnsi="Times New Roman" w:cs="Times New Roman"/>
@@ -2373,9 +2161,9 @@
           <w:szCs w:val="28"/>
           <w:lang w:val="en-US"/>
         </w:rPr>
-        <w:t xml:space="preserve"> </w:t>
-      </w:r>
-      <w:proofErr w:type="spellStart"/>
+        <w:t>bazat</w:t>
+      </w:r>
+      <w:proofErr w:type="spellEnd"/>
       <w:r>
         <w:rPr>
           <w:rFonts w:ascii="Times New Roman" w:eastAsia="Times New Roman" w:hAnsi="Times New Roman" w:cs="Times New Roman"/>
@@ -2385,9 +2173,9 @@
           <w:szCs w:val="28"/>
           <w:lang w:val="en-US"/>
         </w:rPr>
-        <w:t>bazat</w:t>
-      </w:r>
-      <w:proofErr w:type="spellEnd"/>
+        <w:t xml:space="preserve"> pe </w:t>
+      </w:r>
+      <w:proofErr w:type="spellStart"/>
       <w:r>
         <w:rPr>
           <w:rFonts w:ascii="Times New Roman" w:eastAsia="Times New Roman" w:hAnsi="Times New Roman" w:cs="Times New Roman"/>
@@ -2397,9 +2185,9 @@
           <w:szCs w:val="28"/>
           <w:lang w:val="en-US"/>
         </w:rPr>
-        <w:t xml:space="preserve"> pe </w:t>
-      </w:r>
-      <w:proofErr w:type="spellStart"/>
+        <w:t>Arhitectura</w:t>
+      </w:r>
+      <w:proofErr w:type="spellEnd"/>
       <w:r>
         <w:rPr>
           <w:rFonts w:ascii="Times New Roman" w:eastAsia="Times New Roman" w:hAnsi="Times New Roman" w:cs="Times New Roman"/>
@@ -2409,27 +2197,13 @@
           <w:szCs w:val="28"/>
           <w:lang w:val="en-US"/>
         </w:rPr>
-        <w:t>Arhitectura</w:t>
-      </w:r>
-      <w:proofErr w:type="spellEnd"/>
-      <w:r>
-        <w:rPr>
-          <w:rFonts w:ascii="Times New Roman" w:eastAsia="Times New Roman" w:hAnsi="Times New Roman" w:cs="Times New Roman"/>
-          <w:b/>
-          <w:bCs/>
-          <w:sz w:val="28"/>
-          <w:szCs w:val="28"/>
-          <w:lang w:val="en-US"/>
-        </w:rPr>
         <w:t xml:space="preserve"> Transformer (Python)</w:t>
       </w:r>
-    </w:p>
-    <w:p>
-      <w:pPr>
-        <w:pStyle w:val="Titlu1"/>
-        <w:widowControl w:val="0"/>
-        <w:spacing w:before="29" w:line="344" w:lineRule="auto"/>
-        <w:ind w:right="4"/>
+      <w:bookmarkEnd w:id="2"/>
+    </w:p>
+    <w:p>
+      <w:pPr>
+        <w:spacing w:before="120" w:after="240"/>
         <w:rPr>
           <w:rFonts w:ascii="Times New Roman" w:eastAsia="Times New Roman" w:hAnsi="Times New Roman" w:cs="Times New Roman"/>
           <w:sz w:val="24"/>
@@ -2480,10 +2254,7 @@
     </w:p>
     <w:p>
       <w:pPr>
-        <w:pStyle w:val="Titlu1"/>
-        <w:widowControl w:val="0"/>
-        <w:spacing w:before="29" w:line="344" w:lineRule="auto"/>
-        <w:ind w:right="4"/>
+        <w:spacing w:before="120" w:after="240"/>
         <w:rPr>
           <w:rFonts w:ascii="Times New Roman" w:eastAsia="Times New Roman" w:hAnsi="Times New Roman" w:cs="Times New Roman"/>
           <w:sz w:val="24"/>
@@ -3414,37 +3185,58 @@
     </w:p>
     <w:p>
       <w:pPr>
-        <w:pStyle w:val="Titlu1"/>
-        <w:widowControl w:val="0"/>
-        <w:spacing w:before="29" w:line="344" w:lineRule="auto"/>
-        <w:ind w:right="4"/>
-        <w:rPr>
-          <w:rFonts w:ascii="Times New Roman" w:eastAsia="Times New Roman" w:hAnsi="Times New Roman" w:cs="Times New Roman"/>
-          <w:sz w:val="24"/>
-          <w:szCs w:val="24"/>
-          <w:lang w:val="ru-RU"/>
-        </w:rPr>
-      </w:pPr>
-      <w:r>
-        <w:rPr>
-          <w:rFonts w:ascii="Times New Roman" w:eastAsia="Times New Roman" w:hAnsi="Times New Roman" w:cs="Times New Roman"/>
-          <w:sz w:val="24"/>
-          <w:szCs w:val="24"/>
-          <w:lang w:val="ru-RU"/>
-        </w:rPr>
-        <w:t>2. Obiectivele Proiectului</w:t>
-      </w:r>
-    </w:p>
-    <w:p>
-      <w:pPr>
-        <w:pStyle w:val="Titlu1"/>
-        <w:widowControl w:val="0"/>
-        <w:numPr>
-          <w:ilvl w:val="0"/>
-          <w:numId w:val="6"/>
-        </w:numPr>
-        <w:spacing w:before="29" w:line="344" w:lineRule="auto"/>
-        <w:ind w:right="4"/>
+        <w:spacing w:before="120" w:after="240"/>
+        <w:rPr>
+          <w:rFonts w:ascii="Times New Roman" w:eastAsia="Times New Roman" w:hAnsi="Times New Roman" w:cs="Times New Roman"/>
+          <w:sz w:val="24"/>
+          <w:szCs w:val="24"/>
+          <w:lang w:val="en-US"/>
+        </w:rPr>
+      </w:pPr>
+      <w:r>
+        <w:rPr>
+          <w:rFonts w:ascii="Times New Roman" w:eastAsia="Times New Roman" w:hAnsi="Times New Roman" w:cs="Times New Roman"/>
+          <w:sz w:val="24"/>
+          <w:szCs w:val="24"/>
+          <w:lang w:val="en-US"/>
+        </w:rPr>
+        <w:t xml:space="preserve">2. </w:t>
+      </w:r>
+      <w:proofErr w:type="spellStart"/>
+      <w:r>
+        <w:rPr>
+          <w:rFonts w:ascii="Times New Roman" w:eastAsia="Times New Roman" w:hAnsi="Times New Roman" w:cs="Times New Roman"/>
+          <w:sz w:val="24"/>
+          <w:szCs w:val="24"/>
+          <w:lang w:val="en-US"/>
+        </w:rPr>
+        <w:t>Obiectivele</w:t>
+      </w:r>
+      <w:proofErr w:type="spellEnd"/>
+      <w:r>
+        <w:rPr>
+          <w:rFonts w:ascii="Times New Roman" w:eastAsia="Times New Roman" w:hAnsi="Times New Roman" w:cs="Times New Roman"/>
+          <w:sz w:val="24"/>
+          <w:szCs w:val="24"/>
+          <w:lang w:val="en-US"/>
+        </w:rPr>
+        <w:t xml:space="preserve"> </w:t>
+      </w:r>
+      <w:proofErr w:type="spellStart"/>
+      <w:r>
+        <w:rPr>
+          <w:rFonts w:ascii="Times New Roman" w:eastAsia="Times New Roman" w:hAnsi="Times New Roman" w:cs="Times New Roman"/>
+          <w:sz w:val="24"/>
+          <w:szCs w:val="24"/>
+          <w:lang w:val="en-US"/>
+        </w:rPr>
+        <w:t>Proiectului</w:t>
+      </w:r>
+      <w:proofErr w:type="spellEnd"/>
+    </w:p>
+    <w:p>
+      <w:pPr>
+        <w:spacing w:before="120" w:after="240"/>
         <w:rPr>
           <w:rFonts w:ascii="Times New Roman" w:eastAsia="Times New Roman" w:hAnsi="Times New Roman" w:cs="Times New Roman"/>
           <w:sz w:val="24"/>
@@ -3595,14 +3387,7 @@
     </w:p>
     <w:p>
       <w:pPr>
-        <w:pStyle w:val="Titlu1"/>
-        <w:widowControl w:val="0"/>
-        <w:numPr>
-          <w:ilvl w:val="0"/>
-          <w:numId w:val="6"/>
-        </w:numPr>
-        <w:spacing w:before="29" w:line="344" w:lineRule="auto"/>
-        <w:ind w:right="4"/>
+        <w:spacing w:before="120" w:after="240"/>
         <w:rPr>
           <w:rFonts w:ascii="Times New Roman" w:eastAsia="Times New Roman" w:hAnsi="Times New Roman" w:cs="Times New Roman"/>
           <w:sz w:val="24"/>
@@ -3733,14 +3518,7 @@
     </w:p>
     <w:p>
       <w:pPr>
-        <w:pStyle w:val="Titlu1"/>
-        <w:widowControl w:val="0"/>
-        <w:numPr>
-          <w:ilvl w:val="0"/>
-          <w:numId w:val="6"/>
-        </w:numPr>
-        <w:spacing w:before="29" w:line="344" w:lineRule="auto"/>
-        <w:ind w:right="4"/>
+        <w:spacing w:before="120" w:after="240"/>
         <w:rPr>
           <w:rFonts w:ascii="Times New Roman" w:eastAsia="Times New Roman" w:hAnsi="Times New Roman" w:cs="Times New Roman"/>
           <w:sz w:val="24"/>
@@ -3811,14 +3589,7 @@
     </w:p>
     <w:p>
       <w:pPr>
-        <w:pStyle w:val="Titlu1"/>
-        <w:widowControl w:val="0"/>
-        <w:numPr>
-          <w:ilvl w:val="0"/>
-          <w:numId w:val="6"/>
-        </w:numPr>
-        <w:spacing w:before="29" w:line="344" w:lineRule="auto"/>
-        <w:ind w:right="4"/>
+        <w:spacing w:before="120" w:after="240"/>
         <w:rPr>
           <w:rFonts w:ascii="Times New Roman" w:eastAsia="Times New Roman" w:hAnsi="Times New Roman" w:cs="Times New Roman"/>
           <w:sz w:val="24"/>
@@ -3949,14 +3720,7 @@
     </w:p>
     <w:p>
       <w:pPr>
-        <w:pStyle w:val="Titlu1"/>
-        <w:widowControl w:val="0"/>
-        <w:numPr>
-          <w:ilvl w:val="0"/>
-          <w:numId w:val="6"/>
-        </w:numPr>
-        <w:spacing w:before="29" w:line="344" w:lineRule="auto"/>
-        <w:ind w:right="4"/>
+        <w:spacing w:before="120" w:after="240"/>
         <w:rPr>
           <w:rFonts w:ascii="Times New Roman" w:eastAsia="Times New Roman" w:hAnsi="Times New Roman" w:cs="Times New Roman"/>
           <w:sz w:val="24"/>
@@ -4063,6 +3827,27 @@
           <w:lang w:val="en-US"/>
         </w:rPr>
         <w:t xml:space="preserve"> standard (precum BLEU).</w:t>
+      </w:r>
+    </w:p>
+    <w:p>
+      <w:pPr>
+        <w:rPr>
+          <w:rFonts w:ascii="Times New Roman" w:eastAsia="Times New Roman" w:hAnsi="Times New Roman" w:cs="Times New Roman"/>
+          <w:b/>
+          <w:sz w:val="24"/>
+          <w:szCs w:val="24"/>
+        </w:rPr>
+      </w:pPr>
+      <w:r>
+        <w:rPr>
+          <w:rFonts w:ascii="Times New Roman" w:eastAsia="Times New Roman" w:hAnsi="Times New Roman" w:cs="Times New Roman"/>
+          <w:sz w:val="24"/>
+          <w:szCs w:val="24"/>
+        </w:rPr>
+        <w:t>.</w:t>
+      </w:r>
+      <w:r>
+        <w:br w:type="page"/>
       </w:r>
     </w:p>
     <w:p>
@@ -4079,34 +3864,7 @@
           <w:szCs w:val="24"/>
         </w:rPr>
       </w:pPr>
-      <w:r>
-        <w:rPr>
-          <w:rFonts w:ascii="Times New Roman" w:eastAsia="Times New Roman" w:hAnsi="Times New Roman" w:cs="Times New Roman"/>
-          <w:sz w:val="24"/>
-          <w:szCs w:val="24"/>
-        </w:rPr>
-        <w:t>.</w:t>
-      </w:r>
-      <w:r>
-        <w:br w:type="page"/>
-      </w:r>
-    </w:p>
-    <w:p>
-      <w:pPr>
-        <w:pStyle w:val="Titlu1"/>
-        <w:widowControl w:val="0"/>
-        <w:spacing w:before="29" w:line="344" w:lineRule="auto"/>
-        <w:ind w:right="4"/>
-        <w:jc w:val="center"/>
-        <w:rPr>
-          <w:rFonts w:ascii="Times New Roman" w:eastAsia="Times New Roman" w:hAnsi="Times New Roman" w:cs="Times New Roman"/>
-          <w:b/>
-          <w:sz w:val="24"/>
-          <w:szCs w:val="24"/>
-        </w:rPr>
-      </w:pPr>
-      <w:bookmarkStart w:id="2" w:name="_heading=h.3znysh7" w:colFirst="0" w:colLast="0"/>
-      <w:bookmarkEnd w:id="2"/>
+      <w:bookmarkStart w:id="3" w:name="_Toc243691416"/>
       <w:r>
         <w:rPr>
           <w:rFonts w:ascii="Times New Roman" w:eastAsia="Times New Roman" w:hAnsi="Times New Roman" w:cs="Times New Roman"/>
@@ -4117,6 +3875,7 @@
         <w:lastRenderedPageBreak/>
         <w:t>Planul calendaristic săptămânal</w:t>
       </w:r>
+      <w:bookmarkEnd w:id="3"/>
     </w:p>
     <w:p>
       <w:pPr>
@@ -4272,39 +4031,7 @@
                 <w:sz w:val="24"/>
                 <w:szCs w:val="24"/>
               </w:rPr>
-              <w:t>19</w:t>
-            </w:r>
-            <w:r>
-              <w:rPr>
-                <w:rFonts w:ascii="Times New Roman" w:eastAsia="Times New Roman" w:hAnsi="Times New Roman" w:cs="Times New Roman"/>
-                <w:sz w:val="24"/>
-                <w:szCs w:val="24"/>
-              </w:rPr>
-              <w:t>.</w:t>
-            </w:r>
-            <w:r>
-              <w:rPr>
-                <w:rFonts w:ascii="Times New Roman" w:eastAsia="Times New Roman" w:hAnsi="Times New Roman" w:cs="Times New Roman"/>
-                <w:sz w:val="24"/>
-                <w:szCs w:val="24"/>
-              </w:rPr>
-              <w:t>10</w:t>
-            </w:r>
-            <w:r>
-              <w:rPr>
-                <w:rFonts w:ascii="Times New Roman" w:eastAsia="Times New Roman" w:hAnsi="Times New Roman" w:cs="Times New Roman"/>
-                <w:sz w:val="24"/>
-                <w:szCs w:val="24"/>
-              </w:rPr>
-              <w:t>.202</w:t>
-            </w:r>
-            <w:r>
-              <w:rPr>
-                <w:rFonts w:ascii="Times New Roman" w:eastAsia="Times New Roman" w:hAnsi="Times New Roman" w:cs="Times New Roman"/>
-                <w:sz w:val="24"/>
-                <w:szCs w:val="24"/>
-              </w:rPr>
-              <w:t>6</w:t>
+              <w:t>19.10.2026</w:t>
             </w:r>
           </w:p>
           <w:p>
@@ -4330,39 +4057,7 @@
                 <w:sz w:val="24"/>
                 <w:szCs w:val="24"/>
               </w:rPr>
-              <w:t>07</w:t>
-            </w:r>
-            <w:r>
-              <w:rPr>
-                <w:rFonts w:ascii="Times New Roman" w:eastAsia="Times New Roman" w:hAnsi="Times New Roman" w:cs="Times New Roman"/>
-                <w:sz w:val="24"/>
-                <w:szCs w:val="24"/>
-              </w:rPr>
-              <w:t>.</w:t>
-            </w:r>
-            <w:r>
-              <w:rPr>
-                <w:rFonts w:ascii="Times New Roman" w:eastAsia="Times New Roman" w:hAnsi="Times New Roman" w:cs="Times New Roman"/>
-                <w:sz w:val="24"/>
-                <w:szCs w:val="24"/>
-              </w:rPr>
-              <w:t>12</w:t>
-            </w:r>
-            <w:r>
-              <w:rPr>
-                <w:rFonts w:ascii="Times New Roman" w:eastAsia="Times New Roman" w:hAnsi="Times New Roman" w:cs="Times New Roman"/>
-                <w:sz w:val="24"/>
-                <w:szCs w:val="24"/>
-              </w:rPr>
-              <w:t>.202</w:t>
-            </w:r>
-            <w:r>
-              <w:rPr>
-                <w:rFonts w:ascii="Times New Roman" w:eastAsia="Times New Roman" w:hAnsi="Times New Roman" w:cs="Times New Roman"/>
-                <w:sz w:val="24"/>
-                <w:szCs w:val="24"/>
-              </w:rPr>
-              <w:t>6</w:t>
+              <w:t>07.12.2026</w:t>
             </w:r>
           </w:p>
         </w:tc>
@@ -4396,15 +4091,7 @@
                 <w:sz w:val="24"/>
                 <w:szCs w:val="24"/>
               </w:rPr>
-              <w:t>C</w:t>
-            </w:r>
-            <w:r>
-              <w:rPr>
-                <w:rFonts w:ascii="Times New Roman" w:eastAsia="Times New Roman" w:hAnsi="Times New Roman" w:cs="Times New Roman"/>
-                <w:sz w:val="24"/>
-                <w:szCs w:val="24"/>
-              </w:rPr>
-              <w:t xml:space="preserve">unoștință cu </w:t>
+              <w:t xml:space="preserve">Cunoștință cu </w:t>
             </w:r>
             <w:r>
               <w:rPr>
@@ -4471,15 +4158,7 @@
                 <w:sz w:val="24"/>
                 <w:szCs w:val="24"/>
               </w:rPr>
-              <w:t xml:space="preserve"> </w:t>
-            </w:r>
-            <w:r>
-              <w:rPr>
-                <w:rFonts w:ascii="Times New Roman" w:eastAsia="Times New Roman" w:hAnsi="Times New Roman" w:cs="Times New Roman"/>
-                <w:sz w:val="24"/>
-                <w:szCs w:val="24"/>
-              </w:rPr>
-              <w:t>Primele pregătiri și denumirea proiectului pentru practică</w:t>
+              <w:t xml:space="preserve"> Primele pregătiri și denumirea proiectului pentru practică</w:t>
             </w:r>
           </w:p>
           <w:p>
@@ -4553,15 +4232,7 @@
                 <w:sz w:val="24"/>
                 <w:szCs w:val="24"/>
               </w:rPr>
-              <w:t>Documentare, Pregătirea Mediului și Setul de Date</w:t>
-            </w:r>
-            <w:r>
-              <w:rPr>
-                <w:rFonts w:ascii="Times New Roman" w:eastAsia="Times New Roman" w:hAnsi="Times New Roman" w:cs="Times New Roman"/>
-                <w:sz w:val="24"/>
-                <w:szCs w:val="24"/>
-              </w:rPr>
-              <w:t xml:space="preserve"> </w:t>
+              <w:t xml:space="preserve">Documentare, Pregătirea Mediului și Setul de Date </w:t>
             </w:r>
           </w:p>
           <w:p>
@@ -4908,7 +4579,21 @@
       <w:pPr>
         <w:widowControl w:val="0"/>
         <w:spacing w:before="29" w:line="344" w:lineRule="auto"/>
-        <w:ind w:right="240" w:firstLine="850"/>
+        <w:ind w:firstLine="850"/>
+        <w:jc w:val="center"/>
+        <w:rPr>
+          <w:rFonts w:ascii="Times New Roman" w:eastAsia="Times New Roman" w:hAnsi="Times New Roman" w:cs="Times New Roman"/>
+          <w:b/>
+          <w:sz w:val="24"/>
+          <w:szCs w:val="24"/>
+        </w:rPr>
+      </w:pPr>
+    </w:p>
+    <w:p>
+      <w:pPr>
+        <w:widowControl w:val="0"/>
+        <w:spacing w:before="29" w:line="344" w:lineRule="auto"/>
+        <w:ind w:firstLine="850"/>
         <w:jc w:val="right"/>
         <w:rPr>
           <w:rFonts w:ascii="Times New Roman" w:eastAsia="Times New Roman" w:hAnsi="Times New Roman" w:cs="Times New Roman"/>
@@ -4922,7 +4607,6 @@
       <w:pPr>
         <w:widowControl w:val="0"/>
         <w:spacing w:before="29" w:line="344" w:lineRule="auto"/>
-        <w:ind w:right="240" w:firstLine="850"/>
         <w:jc w:val="right"/>
         <w:rPr>
           <w:rFonts w:ascii="Times New Roman" w:eastAsia="Times New Roman" w:hAnsi="Times New Roman" w:cs="Times New Roman"/>
@@ -4931,206 +4615,172 @@
           <w:szCs w:val="24"/>
         </w:rPr>
       </w:pPr>
-    </w:p>
-    <w:p>
-      <w:pPr>
-        <w:widowControl w:val="0"/>
-        <w:spacing w:before="29" w:line="344" w:lineRule="auto"/>
-        <w:ind w:right="240" w:firstLine="850"/>
+      <w:r>
+        <w:rPr>
+          <w:rFonts w:ascii="Times New Roman" w:eastAsia="Times New Roman" w:hAnsi="Times New Roman" w:cs="Times New Roman"/>
+          <w:b/>
+          <w:sz w:val="24"/>
+          <w:szCs w:val="24"/>
+        </w:rPr>
+        <w:t>Conducătorul practicii:</w:t>
+      </w:r>
+    </w:p>
+    <w:p>
+      <w:pPr>
+        <w:widowControl w:val="0"/>
+        <w:spacing w:before="29" w:line="344" w:lineRule="auto"/>
         <w:jc w:val="right"/>
         <w:rPr>
           <w:rFonts w:ascii="Times New Roman" w:eastAsia="Times New Roman" w:hAnsi="Times New Roman" w:cs="Times New Roman"/>
-          <w:b/>
-          <w:sz w:val="24"/>
-          <w:szCs w:val="24"/>
-        </w:rPr>
-      </w:pPr>
-      <w:r>
-        <w:rPr>
-          <w:rFonts w:ascii="Times New Roman" w:eastAsia="Times New Roman" w:hAnsi="Times New Roman" w:cs="Times New Roman"/>
-          <w:b/>
-          <w:sz w:val="24"/>
-          <w:szCs w:val="24"/>
-        </w:rPr>
-        <w:t>Conducătorul practicii:</w:t>
-      </w:r>
-    </w:p>
-    <w:p>
-      <w:pPr>
-        <w:widowControl w:val="0"/>
-        <w:spacing w:before="29" w:line="344" w:lineRule="auto"/>
-        <w:ind w:right="240" w:firstLine="850"/>
+          <w:bCs/>
+          <w:sz w:val="24"/>
+          <w:szCs w:val="24"/>
+        </w:rPr>
+      </w:pPr>
+      <w:r>
+        <w:rPr>
+          <w:rFonts w:ascii="Times New Roman" w:eastAsia="Times New Roman" w:hAnsi="Times New Roman" w:cs="Times New Roman"/>
+          <w:bCs/>
+          <w:sz w:val="24"/>
+          <w:szCs w:val="24"/>
+        </w:rPr>
+        <w:t xml:space="preserve">Nume, Prenume: </w:t>
+      </w:r>
+      <w:proofErr w:type="spellStart"/>
+      <w:r>
+        <w:rPr>
+          <w:rFonts w:ascii="Times New Roman" w:eastAsia="Times New Roman" w:hAnsi="Times New Roman" w:cs="Times New Roman"/>
+          <w:bCs/>
+          <w:sz w:val="24"/>
+          <w:szCs w:val="24"/>
+        </w:rPr>
+        <w:t>Parahonco</w:t>
+      </w:r>
+      <w:proofErr w:type="spellEnd"/>
+      <w:r>
+        <w:rPr>
+          <w:rFonts w:ascii="Times New Roman" w:eastAsia="Times New Roman" w:hAnsi="Times New Roman" w:cs="Times New Roman"/>
+          <w:bCs/>
+          <w:sz w:val="24"/>
+          <w:szCs w:val="24"/>
+        </w:rPr>
+        <w:t xml:space="preserve"> Alexandr</w:t>
+      </w:r>
+    </w:p>
+    <w:p>
+      <w:pPr>
+        <w:widowControl w:val="0"/>
+        <w:spacing w:before="29" w:line="344" w:lineRule="auto"/>
         <w:jc w:val="right"/>
         <w:rPr>
           <w:rFonts w:ascii="Times New Roman" w:eastAsia="Times New Roman" w:hAnsi="Times New Roman" w:cs="Times New Roman"/>
-          <w:sz w:val="24"/>
-          <w:szCs w:val="24"/>
-        </w:rPr>
-      </w:pPr>
-      <w:r>
-        <w:rPr>
-          <w:rFonts w:ascii="Times New Roman" w:eastAsia="Times New Roman" w:hAnsi="Times New Roman" w:cs="Times New Roman"/>
-          <w:sz w:val="24"/>
-          <w:szCs w:val="24"/>
-        </w:rPr>
-        <w:t xml:space="preserve">Nume, Prenume: Sergiu </w:t>
-      </w:r>
-      <w:proofErr w:type="spellStart"/>
-      <w:r>
-        <w:rPr>
-          <w:rFonts w:ascii="Times New Roman" w:eastAsia="Times New Roman" w:hAnsi="Times New Roman" w:cs="Times New Roman"/>
-          <w:sz w:val="24"/>
-          <w:szCs w:val="24"/>
-        </w:rPr>
-        <w:t>Chilat</w:t>
-      </w:r>
-      <w:proofErr w:type="spellEnd"/>
-      <w:r>
-        <w:rPr>
-          <w:rFonts w:ascii="Times New Roman" w:eastAsia="Times New Roman" w:hAnsi="Times New Roman" w:cs="Times New Roman"/>
-          <w:sz w:val="24"/>
-          <w:szCs w:val="24"/>
-        </w:rPr>
-        <w:t xml:space="preserve"> </w:t>
-      </w:r>
-    </w:p>
-    <w:p>
-      <w:pPr>
-        <w:ind w:left="1440" w:right="240"/>
+          <w:bCs/>
+          <w:sz w:val="24"/>
+          <w:szCs w:val="24"/>
+        </w:rPr>
+      </w:pPr>
+      <w:r>
+        <w:rPr>
+          <w:rFonts w:ascii="Times New Roman" w:eastAsia="Times New Roman" w:hAnsi="Times New Roman" w:cs="Times New Roman"/>
+          <w:bCs/>
+          <w:sz w:val="24"/>
+          <w:szCs w:val="24"/>
+        </w:rPr>
+        <w:t>Funcția: șef, Direcția Tehnologii Informaționale</w:t>
+      </w:r>
+    </w:p>
+    <w:p>
+      <w:pPr>
+        <w:widowControl w:val="0"/>
+        <w:spacing w:before="29" w:line="344" w:lineRule="auto"/>
         <w:jc w:val="right"/>
         <w:rPr>
           <w:rFonts w:ascii="Times New Roman" w:eastAsia="Times New Roman" w:hAnsi="Times New Roman" w:cs="Times New Roman"/>
-          <w:sz w:val="24"/>
-          <w:szCs w:val="24"/>
-        </w:rPr>
-      </w:pPr>
-      <w:r>
-        <w:rPr>
-          <w:rFonts w:ascii="Times New Roman" w:eastAsia="Times New Roman" w:hAnsi="Times New Roman" w:cs="Times New Roman"/>
-          <w:sz w:val="24"/>
-          <w:szCs w:val="24"/>
-        </w:rPr>
-        <w:t xml:space="preserve">Funcția: administrator </w:t>
-      </w:r>
-    </w:p>
-    <w:p>
-      <w:pPr>
-        <w:ind w:left="1440" w:right="240"/>
+          <w:bCs/>
+          <w:sz w:val="24"/>
+          <w:szCs w:val="24"/>
+        </w:rPr>
+      </w:pPr>
+      <w:r>
+        <w:rPr>
+          <w:rFonts w:ascii="Times New Roman" w:eastAsia="Times New Roman" w:hAnsi="Times New Roman" w:cs="Times New Roman"/>
+          <w:bCs/>
+          <w:sz w:val="24"/>
+          <w:szCs w:val="24"/>
+        </w:rPr>
+        <w:t>Telefon de contact: 0231 52 381</w:t>
+      </w:r>
+    </w:p>
+    <w:p>
+      <w:pPr>
+        <w:widowControl w:val="0"/>
+        <w:spacing w:before="29" w:line="344" w:lineRule="auto"/>
         <w:jc w:val="right"/>
         <w:rPr>
           <w:rFonts w:ascii="Times New Roman" w:eastAsia="Times New Roman" w:hAnsi="Times New Roman" w:cs="Times New Roman"/>
-          <w:sz w:val="24"/>
-          <w:szCs w:val="24"/>
-        </w:rPr>
-      </w:pPr>
-      <w:r>
-        <w:rPr>
-          <w:rFonts w:ascii="Times New Roman" w:eastAsia="Times New Roman" w:hAnsi="Times New Roman" w:cs="Times New Roman"/>
-          <w:sz w:val="24"/>
-          <w:szCs w:val="24"/>
-        </w:rPr>
-        <w:t>Telefon de contact: +37360333284</w:t>
-      </w:r>
-    </w:p>
-    <w:p>
-      <w:pPr>
-        <w:ind w:left="1440" w:right="240"/>
+          <w:bCs/>
+          <w:sz w:val="24"/>
+          <w:szCs w:val="24"/>
+        </w:rPr>
+      </w:pPr>
+      <w:r>
+        <w:rPr>
+          <w:rFonts w:ascii="Times New Roman" w:eastAsia="Times New Roman" w:hAnsi="Times New Roman" w:cs="Times New Roman"/>
+          <w:bCs/>
+          <w:sz w:val="24"/>
+          <w:szCs w:val="24"/>
+        </w:rPr>
+        <w:t>Adresa de e-mail: alexandr.parahonco@usarb.md</w:t>
+      </w:r>
+    </w:p>
+    <w:p>
+      <w:pPr>
+        <w:widowControl w:val="0"/>
+        <w:spacing w:before="29" w:line="344" w:lineRule="auto"/>
         <w:jc w:val="right"/>
         <w:rPr>
           <w:rFonts w:ascii="Times New Roman" w:eastAsia="Times New Roman" w:hAnsi="Times New Roman" w:cs="Times New Roman"/>
-          <w:sz w:val="24"/>
-          <w:szCs w:val="24"/>
-        </w:rPr>
-      </w:pPr>
-      <w:r>
-        <w:rPr>
-          <w:rFonts w:ascii="Times New Roman" w:eastAsia="Times New Roman" w:hAnsi="Times New Roman" w:cs="Times New Roman"/>
-          <w:sz w:val="24"/>
-          <w:szCs w:val="24"/>
-        </w:rPr>
-        <w:t xml:space="preserve">Adresa de e-mail: </w:t>
-      </w:r>
-      <w:hyperlink r:id="rId9">
-        <w:r>
-          <w:rPr>
-            <w:rFonts w:ascii="Times New Roman" w:eastAsia="Times New Roman" w:hAnsi="Times New Roman" w:cs="Times New Roman"/>
-            <w:color w:val="1155CC"/>
-            <w:sz w:val="24"/>
-            <w:szCs w:val="24"/>
-            <w:u w:val="single"/>
-          </w:rPr>
-          <w:t>chilatsergiu@gmail.com</w:t>
-        </w:r>
-      </w:hyperlink>
-    </w:p>
-    <w:p>
-      <w:pPr>
-        <w:ind w:left="720" w:right="240"/>
+          <w:bCs/>
+          <w:sz w:val="24"/>
+          <w:szCs w:val="24"/>
+        </w:rPr>
+      </w:pPr>
+      <w:r>
+        <w:rPr>
+          <w:rFonts w:ascii="Times New Roman" w:eastAsia="Times New Roman" w:hAnsi="Times New Roman" w:cs="Times New Roman"/>
+          <w:bCs/>
+          <w:sz w:val="24"/>
+          <w:szCs w:val="24"/>
+        </w:rPr>
+        <w:t>Semnătura</w:t>
+      </w:r>
+    </w:p>
+    <w:p>
+      <w:pPr>
+        <w:widowControl w:val="0"/>
+        <w:spacing w:before="29" w:line="344" w:lineRule="auto"/>
         <w:jc w:val="right"/>
         <w:rPr>
           <w:rFonts w:ascii="Times New Roman" w:eastAsia="Times New Roman" w:hAnsi="Times New Roman" w:cs="Times New Roman"/>
-          <w:sz w:val="24"/>
-          <w:szCs w:val="24"/>
-        </w:rPr>
-      </w:pPr>
-      <w:r>
-        <w:rPr>
-          <w:rFonts w:ascii="Times New Roman" w:eastAsia="Times New Roman" w:hAnsi="Times New Roman" w:cs="Times New Roman"/>
-          <w:sz w:val="24"/>
-          <w:szCs w:val="24"/>
-        </w:rPr>
-        <w:t>Semnătura</w:t>
-      </w:r>
-    </w:p>
-    <w:p>
-      <w:pPr>
-        <w:ind w:left="720" w:right="240"/>
-        <w:jc w:val="right"/>
-        <w:rPr>
-          <w:rFonts w:ascii="Times New Roman" w:eastAsia="Times New Roman" w:hAnsi="Times New Roman" w:cs="Times New Roman"/>
-          <w:sz w:val="24"/>
-          <w:szCs w:val="24"/>
-        </w:rPr>
-      </w:pPr>
-    </w:p>
-    <w:p>
-      <w:pPr>
-        <w:ind w:left="720" w:right="240"/>
-        <w:jc w:val="right"/>
-        <w:rPr>
-          <w:rFonts w:ascii="Times New Roman" w:eastAsia="Times New Roman" w:hAnsi="Times New Roman" w:cs="Times New Roman"/>
-          <w:sz w:val="24"/>
-          <w:szCs w:val="24"/>
-        </w:rPr>
-      </w:pPr>
-      <w:r>
-        <w:rPr>
-          <w:rFonts w:ascii="Times New Roman" w:eastAsia="Times New Roman" w:hAnsi="Times New Roman" w:cs="Times New Roman"/>
-          <w:sz w:val="24"/>
-          <w:szCs w:val="24"/>
-        </w:rPr>
-        <w:t>____________</w:t>
-      </w:r>
-    </w:p>
-    <w:p>
-      <w:pPr>
-        <w:widowControl w:val="0"/>
-        <w:spacing w:before="29" w:line="344" w:lineRule="auto"/>
-        <w:ind w:right="1034"/>
-        <w:jc w:val="center"/>
-        <w:rPr>
-          <w:rFonts w:ascii="Times New Roman" w:eastAsia="Times New Roman" w:hAnsi="Times New Roman" w:cs="Times New Roman"/>
-          <w:b/>
-          <w:sz w:val="24"/>
-          <w:szCs w:val="24"/>
-        </w:rPr>
-      </w:pPr>
-    </w:p>
-    <w:p>
-      <w:pPr>
-        <w:widowControl w:val="0"/>
-        <w:spacing w:before="29" w:line="344" w:lineRule="auto"/>
-        <w:ind w:right="1034"/>
+          <w:bCs/>
+          <w:sz w:val="24"/>
+          <w:szCs w:val="24"/>
+        </w:rPr>
+      </w:pPr>
+      <w:r>
+        <w:rPr>
+          <w:rFonts w:ascii="Times New Roman" w:eastAsia="Times New Roman" w:hAnsi="Times New Roman" w:cs="Times New Roman"/>
+          <w:bCs/>
+          <w:sz w:val="24"/>
+          <w:szCs w:val="24"/>
+        </w:rPr>
+        <w:t>___________</w:t>
+      </w:r>
+    </w:p>
+    <w:p>
+      <w:pPr>
+        <w:widowControl w:val="0"/>
+        <w:spacing w:before="29" w:line="344" w:lineRule="auto"/>
         <w:jc w:val="center"/>
         <w:rPr>
           <w:rFonts w:ascii="Times New Roman" w:eastAsia="Times New Roman" w:hAnsi="Times New Roman" w:cs="Times New Roman"/>
@@ -5154,8 +4804,7 @@
           <w:szCs w:val="24"/>
         </w:rPr>
       </w:pPr>
-      <w:bookmarkStart w:id="3" w:name="_heading=h.2et92p0" w:colFirst="0" w:colLast="0"/>
-      <w:bookmarkEnd w:id="3"/>
+      <w:bookmarkStart w:id="4" w:name="_Toc243691417"/>
       <w:r>
         <w:rPr>
           <w:rFonts w:ascii="Times New Roman" w:eastAsia="Times New Roman" w:hAnsi="Times New Roman" w:cs="Times New Roman"/>
@@ -5166,6 +4815,7 @@
         <w:lastRenderedPageBreak/>
         <w:t>Agenda zilnică a lucrărilor executate</w:t>
       </w:r>
+      <w:bookmarkEnd w:id="4"/>
     </w:p>
     <w:p>
       <w:pPr>
@@ -5181,8 +4831,7 @@
           <w:szCs w:val="24"/>
         </w:rPr>
       </w:pPr>
-      <w:bookmarkStart w:id="4" w:name="_heading=h.tyjcwt" w:colFirst="0" w:colLast="0"/>
-      <w:bookmarkEnd w:id="4"/>
+      <w:bookmarkStart w:id="5" w:name="_Toc243691418"/>
       <w:r>
         <w:rPr>
           <w:rFonts w:ascii="Times New Roman" w:eastAsia="Times New Roman" w:hAnsi="Times New Roman" w:cs="Times New Roman"/>
@@ -5192,6 +4841,7 @@
         </w:rPr>
         <w:t>Săptămâna I</w:t>
       </w:r>
+      <w:bookmarkEnd w:id="5"/>
     </w:p>
     <w:tbl>
       <w:tblPr>
@@ -5414,15 +5064,7 @@
                 <w:sz w:val="24"/>
                 <w:szCs w:val="24"/>
               </w:rPr>
-              <w:t>C</w:t>
-            </w:r>
-            <w:r>
-              <w:rPr>
-                <w:rFonts w:ascii="Times New Roman" w:eastAsia="Times New Roman" w:hAnsi="Times New Roman" w:cs="Times New Roman"/>
-                <w:sz w:val="24"/>
-                <w:szCs w:val="24"/>
-              </w:rPr>
-              <w:t xml:space="preserve">unoștință cu </w:t>
+              <w:t xml:space="preserve">Cunoștință cu </w:t>
             </w:r>
             <w:r>
               <w:rPr>
@@ -5653,23 +5295,7 @@
                 <w:sz w:val="24"/>
                 <w:szCs w:val="24"/>
               </w:rPr>
-              <w:t>2</w:t>
-            </w:r>
-            <w:r>
-              <w:rPr>
-                <w:rFonts w:ascii="Times New Roman" w:eastAsia="Times New Roman" w:hAnsi="Times New Roman" w:cs="Times New Roman"/>
-                <w:sz w:val="24"/>
-                <w:szCs w:val="24"/>
-              </w:rPr>
-              <w:t>1</w:t>
-            </w:r>
-            <w:r>
-              <w:rPr>
-                <w:rFonts w:ascii="Times New Roman" w:eastAsia="Times New Roman" w:hAnsi="Times New Roman" w:cs="Times New Roman"/>
-                <w:sz w:val="24"/>
-                <w:szCs w:val="24"/>
-              </w:rPr>
-              <w:t>.10</w:t>
+              <w:t>21.10</w:t>
             </w:r>
           </w:p>
         </w:tc>
@@ -5823,23 +5449,7 @@
                 <w:sz w:val="24"/>
                 <w:szCs w:val="24"/>
               </w:rPr>
-              <w:t>2</w:t>
-            </w:r>
-            <w:r>
-              <w:rPr>
-                <w:rFonts w:ascii="Times New Roman" w:eastAsia="Times New Roman" w:hAnsi="Times New Roman" w:cs="Times New Roman"/>
-                <w:sz w:val="24"/>
-                <w:szCs w:val="24"/>
-              </w:rPr>
-              <w:t>2</w:t>
-            </w:r>
-            <w:r>
-              <w:rPr>
-                <w:rFonts w:ascii="Times New Roman" w:eastAsia="Times New Roman" w:hAnsi="Times New Roman" w:cs="Times New Roman"/>
-                <w:sz w:val="24"/>
-                <w:szCs w:val="24"/>
-              </w:rPr>
-              <w:t>.10</w:t>
+              <w:t>22.10</w:t>
             </w:r>
           </w:p>
         </w:tc>
@@ -5947,23 +5557,7 @@
                 <w:sz w:val="24"/>
                 <w:szCs w:val="24"/>
               </w:rPr>
-              <w:t>2</w:t>
-            </w:r>
-            <w:r>
-              <w:rPr>
-                <w:rFonts w:ascii="Times New Roman" w:eastAsia="Times New Roman" w:hAnsi="Times New Roman" w:cs="Times New Roman"/>
-                <w:sz w:val="24"/>
-                <w:szCs w:val="24"/>
-              </w:rPr>
-              <w:t>3</w:t>
-            </w:r>
-            <w:r>
-              <w:rPr>
-                <w:rFonts w:ascii="Times New Roman" w:eastAsia="Times New Roman" w:hAnsi="Times New Roman" w:cs="Times New Roman"/>
-                <w:sz w:val="24"/>
-                <w:szCs w:val="24"/>
-              </w:rPr>
-              <w:t>.10</w:t>
+              <w:t>23.10</w:t>
             </w:r>
           </w:p>
         </w:tc>
@@ -6138,8 +5732,6 @@
           <w:szCs w:val="24"/>
         </w:rPr>
       </w:pPr>
-      <w:bookmarkStart w:id="5" w:name="_heading=h.3dy6vkm" w:colFirst="0" w:colLast="0"/>
-      <w:bookmarkEnd w:id="5"/>
     </w:p>
     <w:p>
       <w:pPr>
@@ -6285,7 +5877,19 @@
       <w:pPr>
         <w:widowControl w:val="0"/>
         <w:spacing w:before="29" w:line="344" w:lineRule="auto"/>
-        <w:ind w:right="240" w:firstLine="850"/>
+        <w:ind w:right="240"/>
+        <w:rPr>
+          <w:rFonts w:ascii="Times New Roman" w:eastAsia="Times New Roman" w:hAnsi="Times New Roman" w:cs="Times New Roman"/>
+          <w:b/>
+          <w:sz w:val="24"/>
+          <w:szCs w:val="24"/>
+        </w:rPr>
+      </w:pPr>
+    </w:p>
+    <w:p>
+      <w:pPr>
+        <w:widowControl w:val="0"/>
+        <w:spacing w:before="29" w:line="344" w:lineRule="auto"/>
         <w:jc w:val="right"/>
         <w:rPr>
           <w:rFonts w:ascii="Times New Roman" w:eastAsia="Times New Roman" w:hAnsi="Times New Roman" w:cs="Times New Roman"/>
@@ -6294,232 +5898,173 @@
           <w:szCs w:val="24"/>
         </w:rPr>
       </w:pPr>
-    </w:p>
-    <w:p>
-      <w:pPr>
-        <w:widowControl w:val="0"/>
-        <w:spacing w:before="29" w:line="344" w:lineRule="auto"/>
-        <w:ind w:right="240" w:firstLine="850"/>
+      <w:r>
+        <w:rPr>
+          <w:rFonts w:ascii="Times New Roman" w:eastAsia="Times New Roman" w:hAnsi="Times New Roman" w:cs="Times New Roman"/>
+          <w:b/>
+          <w:sz w:val="24"/>
+          <w:szCs w:val="24"/>
+        </w:rPr>
+        <w:t>Conducătorul practicii:</w:t>
+      </w:r>
+    </w:p>
+    <w:p>
+      <w:pPr>
+        <w:widowControl w:val="0"/>
+        <w:spacing w:before="29" w:line="344" w:lineRule="auto"/>
         <w:jc w:val="right"/>
         <w:rPr>
           <w:rFonts w:ascii="Times New Roman" w:eastAsia="Times New Roman" w:hAnsi="Times New Roman" w:cs="Times New Roman"/>
-          <w:b/>
-          <w:sz w:val="24"/>
-          <w:szCs w:val="24"/>
-        </w:rPr>
-      </w:pPr>
-    </w:p>
-    <w:p>
-      <w:pPr>
-        <w:widowControl w:val="0"/>
-        <w:spacing w:before="29" w:line="344" w:lineRule="auto"/>
-        <w:ind w:right="240" w:firstLine="850"/>
+          <w:bCs/>
+          <w:sz w:val="24"/>
+          <w:szCs w:val="24"/>
+        </w:rPr>
+      </w:pPr>
+      <w:r>
+        <w:rPr>
+          <w:rFonts w:ascii="Times New Roman" w:eastAsia="Times New Roman" w:hAnsi="Times New Roman" w:cs="Times New Roman"/>
+          <w:bCs/>
+          <w:sz w:val="24"/>
+          <w:szCs w:val="24"/>
+        </w:rPr>
+        <w:t xml:space="preserve">Nume, Prenume: </w:t>
+      </w:r>
+      <w:proofErr w:type="spellStart"/>
+      <w:r>
+        <w:rPr>
+          <w:rFonts w:ascii="Times New Roman" w:eastAsia="Times New Roman" w:hAnsi="Times New Roman" w:cs="Times New Roman"/>
+          <w:bCs/>
+          <w:sz w:val="24"/>
+          <w:szCs w:val="24"/>
+        </w:rPr>
+        <w:t>Parahonco</w:t>
+      </w:r>
+      <w:proofErr w:type="spellEnd"/>
+      <w:r>
+        <w:rPr>
+          <w:rFonts w:ascii="Times New Roman" w:eastAsia="Times New Roman" w:hAnsi="Times New Roman" w:cs="Times New Roman"/>
+          <w:bCs/>
+          <w:sz w:val="24"/>
+          <w:szCs w:val="24"/>
+        </w:rPr>
+        <w:t xml:space="preserve"> Alexandr</w:t>
+      </w:r>
+    </w:p>
+    <w:p>
+      <w:pPr>
+        <w:widowControl w:val="0"/>
+        <w:spacing w:before="29" w:line="344" w:lineRule="auto"/>
         <w:jc w:val="right"/>
         <w:rPr>
           <w:rFonts w:ascii="Times New Roman" w:eastAsia="Times New Roman" w:hAnsi="Times New Roman" w:cs="Times New Roman"/>
-          <w:b/>
-          <w:sz w:val="24"/>
-          <w:szCs w:val="24"/>
-        </w:rPr>
-      </w:pPr>
-    </w:p>
-    <w:p>
-      <w:pPr>
-        <w:widowControl w:val="0"/>
-        <w:spacing w:before="29" w:line="344" w:lineRule="auto"/>
-        <w:ind w:right="240" w:firstLine="850"/>
+          <w:bCs/>
+          <w:sz w:val="24"/>
+          <w:szCs w:val="24"/>
+        </w:rPr>
+      </w:pPr>
+      <w:r>
+        <w:rPr>
+          <w:rFonts w:ascii="Times New Roman" w:eastAsia="Times New Roman" w:hAnsi="Times New Roman" w:cs="Times New Roman"/>
+          <w:bCs/>
+          <w:sz w:val="24"/>
+          <w:szCs w:val="24"/>
+        </w:rPr>
+        <w:t>Funcția: șef, Direcția Tehnologii Informaționale</w:t>
+      </w:r>
+    </w:p>
+    <w:p>
+      <w:pPr>
+        <w:widowControl w:val="0"/>
+        <w:spacing w:before="29" w:line="344" w:lineRule="auto"/>
         <w:jc w:val="right"/>
         <w:rPr>
           <w:rFonts w:ascii="Times New Roman" w:eastAsia="Times New Roman" w:hAnsi="Times New Roman" w:cs="Times New Roman"/>
-          <w:b/>
-          <w:sz w:val="24"/>
-          <w:szCs w:val="24"/>
-        </w:rPr>
-      </w:pPr>
-      <w:r>
-        <w:rPr>
-          <w:rFonts w:ascii="Times New Roman" w:eastAsia="Times New Roman" w:hAnsi="Times New Roman" w:cs="Times New Roman"/>
-          <w:b/>
-          <w:sz w:val="24"/>
-          <w:szCs w:val="24"/>
-        </w:rPr>
-        <w:t>Conducătorul practicii:</w:t>
-      </w:r>
-    </w:p>
-    <w:p>
-      <w:pPr>
-        <w:widowControl w:val="0"/>
-        <w:spacing w:before="29" w:line="344" w:lineRule="auto"/>
-        <w:ind w:right="240" w:firstLine="850"/>
+          <w:bCs/>
+          <w:sz w:val="24"/>
+          <w:szCs w:val="24"/>
+        </w:rPr>
+      </w:pPr>
+      <w:r>
+        <w:rPr>
+          <w:rFonts w:ascii="Times New Roman" w:eastAsia="Times New Roman" w:hAnsi="Times New Roman" w:cs="Times New Roman"/>
+          <w:bCs/>
+          <w:sz w:val="24"/>
+          <w:szCs w:val="24"/>
+        </w:rPr>
+        <w:t>Telefon de contact: 0231 52 381</w:t>
+      </w:r>
+    </w:p>
+    <w:p>
+      <w:pPr>
+        <w:widowControl w:val="0"/>
+        <w:spacing w:before="29" w:line="344" w:lineRule="auto"/>
         <w:jc w:val="right"/>
         <w:rPr>
           <w:rFonts w:ascii="Times New Roman" w:eastAsia="Times New Roman" w:hAnsi="Times New Roman" w:cs="Times New Roman"/>
-          <w:sz w:val="24"/>
-          <w:szCs w:val="24"/>
-        </w:rPr>
-      </w:pPr>
-      <w:r>
-        <w:rPr>
-          <w:rFonts w:ascii="Times New Roman" w:eastAsia="Times New Roman" w:hAnsi="Times New Roman" w:cs="Times New Roman"/>
-          <w:sz w:val="24"/>
-          <w:szCs w:val="24"/>
-        </w:rPr>
-        <w:t xml:space="preserve">Nume, Prenume: Sergiu </w:t>
-      </w:r>
-      <w:proofErr w:type="spellStart"/>
-      <w:r>
-        <w:rPr>
-          <w:rFonts w:ascii="Times New Roman" w:eastAsia="Times New Roman" w:hAnsi="Times New Roman" w:cs="Times New Roman"/>
-          <w:sz w:val="24"/>
-          <w:szCs w:val="24"/>
-        </w:rPr>
-        <w:t>Chilat</w:t>
-      </w:r>
-      <w:proofErr w:type="spellEnd"/>
-      <w:r>
-        <w:rPr>
-          <w:rFonts w:ascii="Times New Roman" w:eastAsia="Times New Roman" w:hAnsi="Times New Roman" w:cs="Times New Roman"/>
-          <w:sz w:val="24"/>
-          <w:szCs w:val="24"/>
-        </w:rPr>
-        <w:t xml:space="preserve"> </w:t>
-      </w:r>
-    </w:p>
-    <w:p>
-      <w:pPr>
-        <w:ind w:left="1440" w:right="240"/>
+          <w:bCs/>
+          <w:sz w:val="24"/>
+          <w:szCs w:val="24"/>
+        </w:rPr>
+      </w:pPr>
+      <w:r>
+        <w:rPr>
+          <w:rFonts w:ascii="Times New Roman" w:eastAsia="Times New Roman" w:hAnsi="Times New Roman" w:cs="Times New Roman"/>
+          <w:bCs/>
+          <w:sz w:val="24"/>
+          <w:szCs w:val="24"/>
+        </w:rPr>
+        <w:t>Adresa de e-mail: alexandr.parahonco@usarb.md</w:t>
+      </w:r>
+    </w:p>
+    <w:p>
+      <w:pPr>
+        <w:widowControl w:val="0"/>
+        <w:spacing w:before="29" w:line="344" w:lineRule="auto"/>
         <w:jc w:val="right"/>
         <w:rPr>
           <w:rFonts w:ascii="Times New Roman" w:eastAsia="Times New Roman" w:hAnsi="Times New Roman" w:cs="Times New Roman"/>
-          <w:sz w:val="24"/>
-          <w:szCs w:val="24"/>
-        </w:rPr>
-      </w:pPr>
-      <w:r>
-        <w:rPr>
-          <w:rFonts w:ascii="Times New Roman" w:eastAsia="Times New Roman" w:hAnsi="Times New Roman" w:cs="Times New Roman"/>
-          <w:sz w:val="24"/>
-          <w:szCs w:val="24"/>
-        </w:rPr>
-        <w:t xml:space="preserve">Funcția: administrator </w:t>
-      </w:r>
-    </w:p>
-    <w:p>
-      <w:pPr>
-        <w:ind w:left="1440" w:right="240"/>
+          <w:bCs/>
+          <w:sz w:val="24"/>
+          <w:szCs w:val="24"/>
+        </w:rPr>
+      </w:pPr>
+      <w:r>
+        <w:rPr>
+          <w:rFonts w:ascii="Times New Roman" w:eastAsia="Times New Roman" w:hAnsi="Times New Roman" w:cs="Times New Roman"/>
+          <w:bCs/>
+          <w:sz w:val="24"/>
+          <w:szCs w:val="24"/>
+        </w:rPr>
+        <w:t>Semnătura</w:t>
+      </w:r>
+    </w:p>
+    <w:p>
+      <w:pPr>
+        <w:widowControl w:val="0"/>
+        <w:spacing w:before="29" w:line="344" w:lineRule="auto"/>
         <w:jc w:val="right"/>
         <w:rPr>
           <w:rFonts w:ascii="Times New Roman" w:eastAsia="Times New Roman" w:hAnsi="Times New Roman" w:cs="Times New Roman"/>
-          <w:sz w:val="24"/>
-          <w:szCs w:val="24"/>
-        </w:rPr>
-      </w:pPr>
-      <w:r>
-        <w:rPr>
-          <w:rFonts w:ascii="Times New Roman" w:eastAsia="Times New Roman" w:hAnsi="Times New Roman" w:cs="Times New Roman"/>
-          <w:sz w:val="24"/>
-          <w:szCs w:val="24"/>
-        </w:rPr>
-        <w:t>Telefon de contact: +37360333284</w:t>
-      </w:r>
-    </w:p>
-    <w:p>
-      <w:pPr>
-        <w:ind w:left="1440" w:right="240"/>
-        <w:jc w:val="right"/>
-        <w:rPr>
-          <w:rFonts w:ascii="Times New Roman" w:eastAsia="Times New Roman" w:hAnsi="Times New Roman" w:cs="Times New Roman"/>
-          <w:sz w:val="24"/>
-          <w:szCs w:val="24"/>
-        </w:rPr>
-      </w:pPr>
-      <w:r>
-        <w:rPr>
-          <w:rFonts w:ascii="Times New Roman" w:eastAsia="Times New Roman" w:hAnsi="Times New Roman" w:cs="Times New Roman"/>
-          <w:sz w:val="24"/>
-          <w:szCs w:val="24"/>
-        </w:rPr>
-        <w:t xml:space="preserve">Adresa de e-mail: </w:t>
-      </w:r>
-      <w:hyperlink r:id="rId10">
-        <w:r>
-          <w:rPr>
-            <w:rFonts w:ascii="Times New Roman" w:eastAsia="Times New Roman" w:hAnsi="Times New Roman" w:cs="Times New Roman"/>
-            <w:color w:val="1155CC"/>
-            <w:sz w:val="24"/>
-            <w:szCs w:val="24"/>
-            <w:u w:val="single"/>
-          </w:rPr>
-          <w:t>chilatsergiu@gmail.com</w:t>
-        </w:r>
-      </w:hyperlink>
-    </w:p>
-    <w:p>
-      <w:pPr>
-        <w:ind w:left="720" w:right="240"/>
-        <w:jc w:val="right"/>
-        <w:rPr>
-          <w:rFonts w:ascii="Times New Roman" w:eastAsia="Times New Roman" w:hAnsi="Times New Roman" w:cs="Times New Roman"/>
-          <w:sz w:val="24"/>
-          <w:szCs w:val="24"/>
-        </w:rPr>
-      </w:pPr>
-      <w:r>
-        <w:rPr>
-          <w:rFonts w:ascii="Times New Roman" w:eastAsia="Times New Roman" w:hAnsi="Times New Roman" w:cs="Times New Roman"/>
-          <w:sz w:val="24"/>
-          <w:szCs w:val="24"/>
-        </w:rPr>
-        <w:t>Semnătura</w:t>
-      </w:r>
-    </w:p>
-    <w:p>
-      <w:pPr>
-        <w:ind w:left="720" w:right="240"/>
-        <w:jc w:val="right"/>
-        <w:rPr>
-          <w:rFonts w:ascii="Times New Roman" w:eastAsia="Times New Roman" w:hAnsi="Times New Roman" w:cs="Times New Roman"/>
-          <w:sz w:val="24"/>
-          <w:szCs w:val="24"/>
-        </w:rPr>
-      </w:pPr>
-    </w:p>
-    <w:p>
-      <w:pPr>
-        <w:ind w:left="720" w:right="240"/>
-        <w:jc w:val="right"/>
-        <w:rPr>
-          <w:rFonts w:ascii="Times New Roman" w:eastAsia="Times New Roman" w:hAnsi="Times New Roman" w:cs="Times New Roman"/>
-          <w:sz w:val="24"/>
-          <w:szCs w:val="24"/>
-        </w:rPr>
-      </w:pPr>
-      <w:r>
-        <w:rPr>
-          <w:rFonts w:ascii="Times New Roman" w:eastAsia="Times New Roman" w:hAnsi="Times New Roman" w:cs="Times New Roman"/>
-          <w:sz w:val="24"/>
-          <w:szCs w:val="24"/>
-        </w:rPr>
-        <w:t>____________</w:t>
-      </w:r>
-    </w:p>
-    <w:p>
-      <w:pPr>
-        <w:widowControl w:val="0"/>
-        <w:spacing w:before="29" w:line="344" w:lineRule="auto"/>
-        <w:ind w:right="1034"/>
-        <w:rPr>
-          <w:rFonts w:ascii="Times New Roman" w:eastAsia="Times New Roman" w:hAnsi="Times New Roman" w:cs="Times New Roman"/>
-          <w:b/>
-          <w:sz w:val="24"/>
-          <w:szCs w:val="24"/>
-        </w:rPr>
-      </w:pPr>
+          <w:bCs/>
+          <w:sz w:val="24"/>
+          <w:szCs w:val="24"/>
+          <w:lang w:val="ro-RO"/>
+        </w:rPr>
+      </w:pPr>
+      <w:r>
+        <w:rPr>
+          <w:rFonts w:ascii="Times New Roman" w:eastAsia="Times New Roman" w:hAnsi="Times New Roman" w:cs="Times New Roman"/>
+          <w:bCs/>
+          <w:sz w:val="24"/>
+          <w:szCs w:val="24"/>
+        </w:rPr>
+        <w:t>___________</w:t>
+      </w:r>
     </w:p>
     <w:sectPr>
-      <w:footerReference w:type="default" r:id="rId11"/>
-      <w:headerReference w:type="first" r:id="rId12"/>
-      <w:footerReference w:type="first" r:id="rId13"/>
+      <w:footerReference w:type="default" r:id="rId9"/>
+      <w:headerReference w:type="first" r:id="rId10"/>
+      <w:footerReference w:type="first" r:id="rId11"/>
       <w:pgSz w:w="11909" w:h="16834"/>
       <w:pgMar w:top="566" w:right="1133" w:bottom="566" w:left="1700" w:header="720" w:footer="720" w:gutter="0"/>
       <w:pgNumType w:start="1"/>
@@ -6652,6 +6197,119 @@
 <file path=word/numbering.xml><?xml version="1.0" encoding="utf-8"?>
 <w:numbering xmlns:wpc="http://schemas.microsoft.com/office/word/2010/wordprocessingCanvas" xmlns:cx="http://schemas.microsoft.com/office/drawing/2014/chartex" xmlns:cx1="http://schemas.microsoft.com/office/drawing/2015/9/8/chartex" xmlns:cx2="http://schemas.microsoft.com/office/drawing/2015/10/21/chartex" xmlns:cx3="http://schemas.microsoft.com/office/drawing/2016/5/9/chartex" xmlns:cx4="http://schemas.microsoft.com/office/drawing/2016/5/10/chartex" xmlns:cx5="http://schemas.microsoft.com/office/drawing/2016/5/11/chartex" xmlns:cx6="http://schemas.microsoft.com/office/drawing/2016/5/12/chartex" xmlns:cx7="http://schemas.microsoft.com/office/drawing/2016/5/13/chartex" xmlns:cx8="http://schemas.microsoft.com/office/drawing/2016/5/14/chartex" xmlns:mc="http://schemas.openxmlformats.org/markup-compatibility/2006" xmlns:aink="http://schemas.microsoft.com/office/drawing/2016/ink" xmlns:am3d="http://schemas.microsoft.com/office/drawing/2017/model3d" xmlns:o="urn:schemas-microsoft-com:office:office" xmlns:oel="http://schemas.microsoft.com/office/2019/extlst" xmlns:r="http://schemas.openxmlformats.org/officeDocument/2006/relationships" xmlns:m="http://schemas.openxmlformats.org/officeDocument/2006/math" xmlns:v="urn:schemas-microsoft-com:vml" xmlns:wp14="http://schemas.microsoft.com/office/word/2010/wordprocessingDrawing" xmlns:wp="http://schemas.openxmlformats.org/drawingml/2006/wordprocessingDrawing" xmlns:w10="urn:schemas-microsoft-com:office:word" xmlns:w="http://schemas.openxmlformats.org/wordprocessingml/2006/main" xmlns:w14="http://schemas.microsoft.com/office/word/2010/wordml" xmlns:w15="http://schemas.microsoft.com/office/word/2012/wordml" xmlns:w16cex="http://schemas.microsoft.com/office/word/2018/wordml/cex" xmlns:w16cid="http://schemas.microsoft.com/office/word/2016/wordml/cid" xmlns:w16="http://schemas.microsoft.com/office/word/2018/wordml" xmlns:w16du="http://schemas.microsoft.com/office/word/2023/wordml/word16du" xmlns:w16sdtdh="http://schemas.microsoft.com/office/word/2020/wordml/sdtdatahash" xmlns:w16sdtfl="http://schemas.microsoft.com/office/word/2024/wordml/sdtformatlock" xmlns:w16se="http://schemas.microsoft.com/office/word/2015/wordml/symex" xmlns:wpg="http://schemas.microsoft.com/office/word/2010/wordprocessingGroup" xmlns:wpi="http://schemas.microsoft.com/office/word/2010/wordprocessingInk" xmlns:wne="http://schemas.microsoft.com/office/word/2006/wordml" xmlns:wps="http://schemas.microsoft.com/office/word/2010/wordprocessingShape" mc:Ignorable="w14 w15 w16se w16cid w16 w16cex w16sdtdh w16sdtfl w16du wp14">
   <w:abstractNum w:abstractNumId="0" w15:restartNumberingAfterBreak="0">
+    <w:nsid w:val="05925C73"/>
+    <w:multiLevelType w:val="hybridMultilevel"/>
+    <w:tmpl w:val="6F069412"/>
+    <w:lvl w:ilvl="0" w:tplc="04190005">
+      <w:start w:val="1"/>
+      <w:numFmt w:val="bullet"/>
+      <w:lvlText w:val=""/>
+      <w:lvlJc w:val="left"/>
+      <w:pPr>
+        <w:ind w:left="720" w:hanging="360"/>
+      </w:pPr>
+      <w:rPr>
+        <w:rFonts w:ascii="Wingdings" w:hAnsi="Wingdings" w:hint="default"/>
+      </w:rPr>
+    </w:lvl>
+    <w:lvl w:ilvl="1" w:tplc="FFFFFFFF" w:tentative="1">
+      <w:start w:val="1"/>
+      <w:numFmt w:val="bullet"/>
+      <w:lvlText w:val="o"/>
+      <w:lvlJc w:val="left"/>
+      <w:pPr>
+        <w:ind w:left="1440" w:hanging="360"/>
+      </w:pPr>
+      <w:rPr>
+        <w:rFonts w:ascii="Courier New" w:hAnsi="Courier New" w:cs="Courier New" w:hint="default"/>
+      </w:rPr>
+    </w:lvl>
+    <w:lvl w:ilvl="2" w:tplc="FFFFFFFF" w:tentative="1">
+      <w:start w:val="1"/>
+      <w:numFmt w:val="bullet"/>
+      <w:lvlText w:val=""/>
+      <w:lvlJc w:val="left"/>
+      <w:pPr>
+        <w:ind w:left="2160" w:hanging="360"/>
+      </w:pPr>
+      <w:rPr>
+        <w:rFonts w:ascii="Wingdings" w:hAnsi="Wingdings" w:hint="default"/>
+      </w:rPr>
+    </w:lvl>
+    <w:lvl w:ilvl="3" w:tplc="FFFFFFFF" w:tentative="1">
+      <w:start w:val="1"/>
+      <w:numFmt w:val="bullet"/>
+      <w:lvlText w:val=""/>
+      <w:lvlJc w:val="left"/>
+      <w:pPr>
+        <w:ind w:left="2880" w:hanging="360"/>
+      </w:pPr>
+      <w:rPr>
+        <w:rFonts w:ascii="Symbol" w:hAnsi="Symbol" w:hint="default"/>
+      </w:rPr>
+    </w:lvl>
+    <w:lvl w:ilvl="4" w:tplc="FFFFFFFF" w:tentative="1">
+      <w:start w:val="1"/>
+      <w:numFmt w:val="bullet"/>
+      <w:lvlText w:val="o"/>
+      <w:lvlJc w:val="left"/>
+      <w:pPr>
+        <w:ind w:left="3600" w:hanging="360"/>
+      </w:pPr>
+      <w:rPr>
+        <w:rFonts w:ascii="Courier New" w:hAnsi="Courier New" w:cs="Courier New" w:hint="default"/>
+      </w:rPr>
+    </w:lvl>
+    <w:lvl w:ilvl="5" w:tplc="FFFFFFFF" w:tentative="1">
+      <w:start w:val="1"/>
+      <w:numFmt w:val="bullet"/>
+      <w:lvlText w:val=""/>
+      <w:lvlJc w:val="left"/>
+      <w:pPr>
+        <w:ind w:left="4320" w:hanging="360"/>
+      </w:pPr>
+      <w:rPr>
+        <w:rFonts w:ascii="Wingdings" w:hAnsi="Wingdings" w:hint="default"/>
+      </w:rPr>
+    </w:lvl>
+    <w:lvl w:ilvl="6" w:tplc="FFFFFFFF" w:tentative="1">
+      <w:start w:val="1"/>
+      <w:numFmt w:val="bullet"/>
+      <w:lvlText w:val=""/>
+      <w:lvlJc w:val="left"/>
+      <w:pPr>
+        <w:ind w:left="5040" w:hanging="360"/>
+      </w:pPr>
+      <w:rPr>
+        <w:rFonts w:ascii="Symbol" w:hAnsi="Symbol" w:hint="default"/>
+      </w:rPr>
+    </w:lvl>
+    <w:lvl w:ilvl="7" w:tplc="FFFFFFFF" w:tentative="1">
+      <w:start w:val="1"/>
+      <w:numFmt w:val="bullet"/>
+      <w:lvlText w:val="o"/>
+      <w:lvlJc w:val="left"/>
+      <w:pPr>
+        <w:ind w:left="5760" w:hanging="360"/>
+      </w:pPr>
+      <w:rPr>
+        <w:rFonts w:ascii="Courier New" w:hAnsi="Courier New" w:cs="Courier New" w:hint="default"/>
+      </w:rPr>
+    </w:lvl>
+    <w:lvl w:ilvl="8" w:tplc="FFFFFFFF" w:tentative="1">
+      <w:start w:val="1"/>
+      <w:numFmt w:val="bullet"/>
+      <w:lvlText w:val=""/>
+      <w:lvlJc w:val="left"/>
+      <w:pPr>
+        <w:ind w:left="6480" w:hanging="360"/>
+      </w:pPr>
+      <w:rPr>
+        <w:rFonts w:ascii="Wingdings" w:hAnsi="Wingdings" w:hint="default"/>
+      </w:rPr>
+    </w:lvl>
+  </w:abstractNum>
+  <w:abstractNum w:abstractNumId="1" w15:restartNumberingAfterBreak="0">
     <w:nsid w:val="224C7A98"/>
     <w:multiLevelType w:val="multilevel"/>
     <w:tmpl w:val="F4CE215C"/>
@@ -6764,7 +6422,7 @@
       </w:rPr>
     </w:lvl>
   </w:abstractNum>
-  <w:abstractNum w:abstractNumId="1" w15:restartNumberingAfterBreak="0">
+  <w:abstractNum w:abstractNumId="2" w15:restartNumberingAfterBreak="0">
     <w:nsid w:val="386C54BB"/>
     <w:multiLevelType w:val="multilevel"/>
     <w:tmpl w:val="930EF6A4"/>
@@ -6877,7 +6535,120 @@
       </w:rPr>
     </w:lvl>
   </w:abstractNum>
-  <w:abstractNum w:abstractNumId="2" w15:restartNumberingAfterBreak="0">
+  <w:abstractNum w:abstractNumId="3" w15:restartNumberingAfterBreak="0">
+    <w:nsid w:val="3CB7707F"/>
+    <w:multiLevelType w:val="hybridMultilevel"/>
+    <w:tmpl w:val="309E8346"/>
+    <w:lvl w:ilvl="0" w:tplc="04190001">
+      <w:start w:val="1"/>
+      <w:numFmt w:val="bullet"/>
+      <w:lvlText w:val=""/>
+      <w:lvlJc w:val="left"/>
+      <w:pPr>
+        <w:ind w:left="720" w:hanging="360"/>
+      </w:pPr>
+      <w:rPr>
+        <w:rFonts w:ascii="Symbol" w:hAnsi="Symbol" w:hint="default"/>
+      </w:rPr>
+    </w:lvl>
+    <w:lvl w:ilvl="1" w:tplc="04190003" w:tentative="1">
+      <w:start w:val="1"/>
+      <w:numFmt w:val="bullet"/>
+      <w:lvlText w:val="o"/>
+      <w:lvlJc w:val="left"/>
+      <w:pPr>
+        <w:ind w:left="1440" w:hanging="360"/>
+      </w:pPr>
+      <w:rPr>
+        <w:rFonts w:ascii="Courier New" w:hAnsi="Courier New" w:cs="Courier New" w:hint="default"/>
+      </w:rPr>
+    </w:lvl>
+    <w:lvl w:ilvl="2" w:tplc="04190005" w:tentative="1">
+      <w:start w:val="1"/>
+      <w:numFmt w:val="bullet"/>
+      <w:lvlText w:val=""/>
+      <w:lvlJc w:val="left"/>
+      <w:pPr>
+        <w:ind w:left="2160" w:hanging="360"/>
+      </w:pPr>
+      <w:rPr>
+        <w:rFonts w:ascii="Wingdings" w:hAnsi="Wingdings" w:hint="default"/>
+      </w:rPr>
+    </w:lvl>
+    <w:lvl w:ilvl="3" w:tplc="04190001" w:tentative="1">
+      <w:start w:val="1"/>
+      <w:numFmt w:val="bullet"/>
+      <w:lvlText w:val=""/>
+      <w:lvlJc w:val="left"/>
+      <w:pPr>
+        <w:ind w:left="2880" w:hanging="360"/>
+      </w:pPr>
+      <w:rPr>
+        <w:rFonts w:ascii="Symbol" w:hAnsi="Symbol" w:hint="default"/>
+      </w:rPr>
+    </w:lvl>
+    <w:lvl w:ilvl="4" w:tplc="04190003" w:tentative="1">
+      <w:start w:val="1"/>
+      <w:numFmt w:val="bullet"/>
+      <w:lvlText w:val="o"/>
+      <w:lvlJc w:val="left"/>
+      <w:pPr>
+        <w:ind w:left="3600" w:hanging="360"/>
+      </w:pPr>
+      <w:rPr>
+        <w:rFonts w:ascii="Courier New" w:hAnsi="Courier New" w:cs="Courier New" w:hint="default"/>
+      </w:rPr>
+    </w:lvl>
+    <w:lvl w:ilvl="5" w:tplc="04190005" w:tentative="1">
+      <w:start w:val="1"/>
+      <w:numFmt w:val="bullet"/>
+      <w:lvlText w:val=""/>
+      <w:lvlJc w:val="left"/>
+      <w:pPr>
+        <w:ind w:left="4320" w:hanging="360"/>
+      </w:pPr>
+      <w:rPr>
+        <w:rFonts w:ascii="Wingdings" w:hAnsi="Wingdings" w:hint="default"/>
+      </w:rPr>
+    </w:lvl>
+    <w:lvl w:ilvl="6" w:tplc="04190001" w:tentative="1">
+      <w:start w:val="1"/>
+      <w:numFmt w:val="bullet"/>
+      <w:lvlText w:val=""/>
+      <w:lvlJc w:val="left"/>
+      <w:pPr>
+        <w:ind w:left="5040" w:hanging="360"/>
+      </w:pPr>
+      <w:rPr>
+        <w:rFonts w:ascii="Symbol" w:hAnsi="Symbol" w:hint="default"/>
+      </w:rPr>
+    </w:lvl>
+    <w:lvl w:ilvl="7" w:tplc="04190003" w:tentative="1">
+      <w:start w:val="1"/>
+      <w:numFmt w:val="bullet"/>
+      <w:lvlText w:val="o"/>
+      <w:lvlJc w:val="left"/>
+      <w:pPr>
+        <w:ind w:left="5760" w:hanging="360"/>
+      </w:pPr>
+      <w:rPr>
+        <w:rFonts w:ascii="Courier New" w:hAnsi="Courier New" w:cs="Courier New" w:hint="default"/>
+      </w:rPr>
+    </w:lvl>
+    <w:lvl w:ilvl="8" w:tplc="04190005" w:tentative="1">
+      <w:start w:val="1"/>
+      <w:numFmt w:val="bullet"/>
+      <w:lvlText w:val=""/>
+      <w:lvlJc w:val="left"/>
+      <w:pPr>
+        <w:ind w:left="6480" w:hanging="360"/>
+      </w:pPr>
+      <w:rPr>
+        <w:rFonts w:ascii="Wingdings" w:hAnsi="Wingdings" w:hint="default"/>
+      </w:rPr>
+    </w:lvl>
+  </w:abstractNum>
+  <w:abstractNum w:abstractNumId="4" w15:restartNumberingAfterBreak="0">
     <w:nsid w:val="3FE746AB"/>
     <w:multiLevelType w:val="multilevel"/>
     <w:tmpl w:val="7E34F892"/>
@@ -6990,7 +6761,7 @@
       </w:rPr>
     </w:lvl>
   </w:abstractNum>
-  <w:abstractNum w:abstractNumId="3" w15:restartNumberingAfterBreak="0">
+  <w:abstractNum w:abstractNumId="5" w15:restartNumberingAfterBreak="0">
     <w:nsid w:val="415C2B90"/>
     <w:multiLevelType w:val="multilevel"/>
     <w:tmpl w:val="D9C04EB4"/>
@@ -7103,7 +6874,7 @@
       </w:rPr>
     </w:lvl>
   </w:abstractNum>
-  <w:abstractNum w:abstractNumId="4" w15:restartNumberingAfterBreak="0">
+  <w:abstractNum w:abstractNumId="6" w15:restartNumberingAfterBreak="0">
     <w:nsid w:val="658A2A32"/>
     <w:multiLevelType w:val="multilevel"/>
     <w:tmpl w:val="F76EBEEC"/>
@@ -7216,7 +6987,7 @@
       </w:rPr>
     </w:lvl>
   </w:abstractNum>
-  <w:abstractNum w:abstractNumId="5" w15:restartNumberingAfterBreak="0">
+  <w:abstractNum w:abstractNumId="7" w15:restartNumberingAfterBreak="0">
     <w:nsid w:val="6E0046B0"/>
     <w:multiLevelType w:val="multilevel"/>
     <w:tmpl w:val="47AC19F6"/>
@@ -7366,22 +7137,28 @@
     </w:lvl>
   </w:abstractNum>
   <w:num w:numId="1" w16cid:durableId="139543052">
+    <w:abstractNumId w:val="4"/>
+  </w:num>
+  <w:num w:numId="2" w16cid:durableId="1674452303">
+    <w:abstractNumId w:val="5"/>
+  </w:num>
+  <w:num w:numId="3" w16cid:durableId="341132494">
+    <w:abstractNumId w:val="1"/>
+  </w:num>
+  <w:num w:numId="4" w16cid:durableId="949553455">
+    <w:abstractNumId w:val="6"/>
+  </w:num>
+  <w:num w:numId="5" w16cid:durableId="1357081006">
     <w:abstractNumId w:val="2"/>
   </w:num>
-  <w:num w:numId="2" w16cid:durableId="1674452303">
+  <w:num w:numId="6" w16cid:durableId="912396593">
+    <w:abstractNumId w:val="7"/>
+  </w:num>
+  <w:num w:numId="7" w16cid:durableId="495149534">
     <w:abstractNumId w:val="3"/>
   </w:num>
-  <w:num w:numId="3" w16cid:durableId="341132494">
+  <w:num w:numId="8" w16cid:durableId="1808547147">
     <w:abstractNumId w:val="0"/>
-  </w:num>
-  <w:num w:numId="4" w16cid:durableId="949553455">
-    <w:abstractNumId w:val="4"/>
-  </w:num>
-  <w:num w:numId="5" w16cid:durableId="1357081006">
-    <w:abstractNumId w:val="1"/>
-  </w:num>
-  <w:num w:numId="6" w16cid:durableId="912396593">
-    <w:abstractNumId w:val="5"/>
   </w:num>
 </w:numbering>
 </file>
@@ -8212,6 +7989,73 @@
       </w:tblCellMar>
     </w:tblPr>
   </w:style>
+  <w:style w:type="paragraph" w:styleId="Titlucuprins">
+    <w:name w:val="TOC Heading"/>
+    <w:basedOn w:val="Titlu1"/>
+    <w:next w:val="Normal"/>
+    <w:uiPriority w:val="39"/>
+    <w:unhideWhenUsed/>
+    <w:qFormat/>
+    <w:rsid w:val="00FC3BD4"/>
+    <w:pPr>
+      <w:spacing w:before="240" w:after="0" w:line="259" w:lineRule="auto"/>
+      <w:outlineLvl w:val="9"/>
+    </w:pPr>
+    <w:rPr>
+      <w:rFonts w:asciiTheme="majorHAnsi" w:eastAsiaTheme="majorEastAsia" w:hAnsiTheme="majorHAnsi" w:cstheme="majorBidi"/>
+      <w:color w:val="365F91" w:themeColor="accent1" w:themeShade="BF"/>
+      <w:sz w:val="32"/>
+      <w:szCs w:val="32"/>
+      <w:lang w:val="ru-RU"/>
+    </w:rPr>
+  </w:style>
+  <w:style w:type="paragraph" w:styleId="Cuprins1">
+    <w:name w:val="toc 1"/>
+    <w:basedOn w:val="Normal"/>
+    <w:next w:val="Normal"/>
+    <w:autoRedefine/>
+    <w:uiPriority w:val="39"/>
+    <w:unhideWhenUsed/>
+    <w:rsid w:val="00FC3BD4"/>
+    <w:pPr>
+      <w:spacing w:after="100"/>
+    </w:pPr>
+  </w:style>
+  <w:style w:type="paragraph" w:styleId="Cuprins2">
+    <w:name w:val="toc 2"/>
+    <w:basedOn w:val="Normal"/>
+    <w:next w:val="Normal"/>
+    <w:autoRedefine/>
+    <w:uiPriority w:val="39"/>
+    <w:unhideWhenUsed/>
+    <w:rsid w:val="00FC3BD4"/>
+    <w:pPr>
+      <w:spacing w:after="100"/>
+      <w:ind w:left="220"/>
+    </w:pPr>
+  </w:style>
+  <w:style w:type="character" w:styleId="Hyperlink">
+    <w:name w:val="Hyperlink"/>
+    <w:basedOn w:val="Fontdeparagrafimplicit"/>
+    <w:uiPriority w:val="99"/>
+    <w:unhideWhenUsed/>
+    <w:rsid w:val="00FC3BD4"/>
+    <w:rPr>
+      <w:color w:val="0000FF" w:themeColor="hyperlink"/>
+      <w:u w:val="single"/>
+    </w:rPr>
+  </w:style>
+  <w:style w:type="paragraph" w:styleId="Listparagraf">
+    <w:name w:val="List Paragraph"/>
+    <w:basedOn w:val="Normal"/>
+    <w:uiPriority w:val="34"/>
+    <w:qFormat/>
+    <w:rsid w:val="00FC3BD4"/>
+    <w:pPr>
+      <w:ind w:left="720"/>
+      <w:contextualSpacing/>
+    </w:pPr>
+  </w:style>
 </w:styles>
 </file>
 
@@ -8541,6 +8385,10 @@
 </go:gDocsCustomXmlDataStorage>
 </file>
 
+<file path=customXml/item2.xml><?xml version="1.0" encoding="utf-8"?>
+<b:Sources xmlns:b="http://schemas.openxmlformats.org/officeDocument/2006/bibliography" xmlns="http://schemas.openxmlformats.org/officeDocument/2006/bibliography" SelectedStyle="\APASixthEditionOfficeOnline.xsl" StyleName="APA" Version="6"/>
+</file>
+
 <file path=customXml/itemProps1.xml><?xml version="1.0" encoding="utf-8"?>
 <ds:datastoreItem xmlns:ds="http://schemas.openxmlformats.org/officeDocument/2006/customXml" ds:itemID="{11111111-1234-1234-1234-123412341234}">
   <ds:schemaRefs>
@@ -8548,4 +8396,12 @@
     <ds:schemaRef ds:uri="http://schemas.openxmlformats.org/officeDocument/2006/relationships"/>
   </ds:schemaRefs>
 </ds:datastoreItem>
+</file>
+
+<file path=customXml/itemProps2.xml><?xml version="1.0" encoding="utf-8"?>
+<ds:datastoreItem xmlns:ds="http://schemas.openxmlformats.org/officeDocument/2006/customXml" ds:itemID="{97FEFE78-6605-4522-ABEE-E6E9F8A5B389}">
+  <ds:schemaRefs>
+    <ds:schemaRef ds:uri="http://schemas.openxmlformats.org/officeDocument/2006/bibliography"/>
+  </ds:schemaRefs>
+</ds:datastoreItem>
 </file>
</xml_diff>